<commit_message>
feat: support long policies and finalize I2A2 delivery
</commit_message>
<xml_diff>
--- a/Projeto_Final_Artefatos/InsurMinds_System_Design.docx
+++ b/Projeto_Final_Artefatos/InsurMinds_System_Design.docx
@@ -1,8 +1,8 @@
 
 <file path=word/document.xml><?xml version="1.0" encoding="utf-8"?>
-<w:document xmlns:mc="http://schemas.openxmlformats.org/markup-compatibility/2006" xmlns:o="urn:schemas-microsoft-com:office:office" xmlns:r="http://schemas.openxmlformats.org/officeDocument/2006/relationships" xmlns:m="http://schemas.openxmlformats.org/officeDocument/2006/math" xmlns:v="urn:schemas-microsoft-com:vml" xmlns:wp="http://schemas.openxmlformats.org/drawingml/2006/wordprocessingDrawing" xmlns:w10="urn:schemas-microsoft-com:office:word" xmlns:w="http://schemas.openxmlformats.org/wordprocessingml/2006/main" xmlns:wne="http://schemas.microsoft.com/office/word/2006/wordml" xmlns:sl="http://schemas.openxmlformats.org/schemaLibrary/2006/main" xmlns:a="http://schemas.openxmlformats.org/drawingml/2006/main" xmlns:pic="http://schemas.openxmlformats.org/drawingml/2006/picture" xmlns:c="http://schemas.openxmlformats.org/drawingml/2006/chart" xmlns:lc="http://schemas.openxmlformats.org/drawingml/2006/lockedCanvas" xmlns:dgm="http://schemas.openxmlformats.org/drawingml/2006/diagram" xmlns:wps="http://schemas.microsoft.com/office/word/2010/wordprocessingShape" xmlns:wpg="http://schemas.microsoft.com/office/word/2010/wordprocessingGroup" xmlns:w14="http://schemas.microsoft.com/office/word/2010/wordml" xmlns:w15="http://schemas.microsoft.com/office/word/2012/wordml" xmlns:w16="http://schemas.microsoft.com/office/word/2018/wordml" xmlns:w16cex="http://schemas.microsoft.com/office/word/2018/wordml/cex" xmlns:w16cid="http://schemas.microsoft.com/office/word/2016/wordml/cid" xmlns="http://schemas.microsoft.com/office/tasks/2019/documenttasks" xmlns:cr="http://schemas.microsoft.com/office/comments/2020/reactions">
+<w:document xmlns:ns1="http://schemas.microsoft.com/office/word/2010/wordml" xmlns:ns2="http://schemas.openxmlformats.org/drawingml/2006/wordprocessingDrawing" xmlns:ns3="http://schemas.openxmlformats.org/drawingml/2006/main" xmlns:ns4="http://schemas.openxmlformats.org/drawingml/2006/picture" xmlns:ns5="http://schemas.openxmlformats.org/officeDocument/2006/relationships" xmlns:w="http://schemas.openxmlformats.org/wordprocessingml/2006/main">
   <w:body>
-    <w:p>
+    <w:p ns1:paraId="00000001">
       <w:pPr>
         <w:keepNext w:val="0"/>
         <w:keepLines w:val="0"/>
@@ -33,7 +33,7 @@
         </w:rPr>
       </w:r>
     </w:p>
-    <w:p>
+    <w:p ns1:paraId="00000002">
       <w:pPr>
         <w:keepNext w:val="0"/>
         <w:keepLines w:val="0"/>
@@ -64,7 +64,7 @@
         </w:rPr>
       </w:r>
     </w:p>
-    <w:p>
+    <w:p ns1:paraId="00000003">
       <w:pPr>
         <w:keepNext w:val="0"/>
         <w:keepLines w:val="0"/>
@@ -95,7 +95,7 @@
         </w:rPr>
       </w:r>
     </w:p>
-    <w:p>
+    <w:p ns1:paraId="00000004">
       <w:pPr>
         <w:keepNext w:val="0"/>
         <w:keepLines w:val="0"/>
@@ -126,7 +126,7 @@
         </w:rPr>
       </w:r>
     </w:p>
-    <w:p>
+    <w:p ns1:paraId="00000005">
       <w:pPr>
         <w:keepNext w:val="0"/>
         <w:keepLines w:val="0"/>
@@ -157,7 +157,7 @@
         </w:rPr>
       </w:r>
     </w:p>
-    <w:p>
+    <w:p ns1:paraId="00000006">
       <w:pPr>
         <w:keepNext w:val="0"/>
         <w:keepLines w:val="0"/>
@@ -188,7 +188,7 @@
         </w:rPr>
       </w:r>
     </w:p>
-    <w:p>
+    <w:p ns1:paraId="00000007">
       <w:pPr>
         <w:keepNext w:val="0"/>
         <w:keepLines w:val="0"/>
@@ -219,7 +219,7 @@
         </w:rPr>
       </w:r>
     </w:p>
-    <w:p>
+    <w:p ns1:paraId="00000008">
       <w:pPr>
         <w:spacing w:after="0" w:before="0" w:line="20" w:lineRule="auto"/>
         <w:rPr>
@@ -233,7 +233,7 @@
         </w:rPr>
       </w:r>
     </w:p>
-    <w:p>
+    <w:p ns1:paraId="00000009">
       <w:pPr>
         <w:pStyle w:val="Title"/>
         <w:spacing w:line="240" w:lineRule="auto"/>
@@ -250,7 +250,7 @@
         <w:t>InsurMinds</w:t>
       </w:r>
     </w:p>
-    <w:p>
+    <w:p ns1:paraId="0000000A">
       <w:pPr>
         <w:pStyle w:val="Title"/>
         <w:spacing w:line="240" w:lineRule="auto"/>
@@ -264,7 +264,7 @@
         <w:t>Plataforma de análise e comparação de apólices D&amp;O</w:t>
       </w:r>
     </w:p>
-    <w:p>
+    <w:p ns1:paraId="0000000B">
       <w:pPr>
         <w:rPr>
           <w:rFonts w:ascii="Helvetica Neue" w:cs="Helvetica Neue" w:eastAsia="Helvetica Neue" w:hAnsi="Helvetica Neue"/>
@@ -276,7 +276,7 @@
         </w:rPr>
       </w:r>
     </w:p>
-    <w:p>
+    <w:p ns1:paraId="0000000C">
       <w:pPr>
         <w:rPr>
           <w:rFonts w:ascii="Helvetica Neue" w:cs="Helvetica Neue" w:eastAsia="Helvetica Neue" w:hAnsi="Helvetica Neue"/>
@@ -288,7 +288,7 @@
         </w:rPr>
       </w:r>
     </w:p>
-    <w:p>
+    <w:p ns1:paraId="0000000D">
       <w:pPr>
         <w:rPr>
           <w:rFonts w:ascii="Helvetica Neue" w:cs="Helvetica Neue" w:eastAsia="Helvetica Neue" w:hAnsi="Helvetica Neue"/>
@@ -300,7 +300,7 @@
         </w:rPr>
       </w:r>
     </w:p>
-    <w:p>
+    <w:p ns1:paraId="0000000E">
       <w:pPr>
         <w:rPr>
           <w:rFonts w:ascii="Helvetica Neue" w:cs="Helvetica Neue" w:eastAsia="Helvetica Neue" w:hAnsi="Helvetica Neue"/>
@@ -312,7 +312,7 @@
         </w:rPr>
       </w:r>
     </w:p>
-    <w:p>
+    <w:p ns1:paraId="0000000F">
       <w:pPr>
         <w:rPr>
           <w:rFonts w:ascii="Helvetica Neue" w:cs="Helvetica Neue" w:eastAsia="Helvetica Neue" w:hAnsi="Helvetica Neue"/>
@@ -324,7 +324,7 @@
         </w:rPr>
       </w:r>
     </w:p>
-    <w:p>
+    <w:p ns1:paraId="00000010">
       <w:pPr>
         <w:rPr>
           <w:rFonts w:ascii="Helvetica Neue" w:cs="Helvetica Neue" w:eastAsia="Helvetica Neue" w:hAnsi="Helvetica Neue"/>
@@ -336,7 +336,7 @@
         </w:rPr>
       </w:r>
     </w:p>
-    <w:p>
+    <w:p ns1:paraId="00000011">
       <w:pPr>
         <w:rPr>
           <w:rFonts w:ascii="Helvetica Neue" w:cs="Helvetica Neue" w:eastAsia="Helvetica Neue" w:hAnsi="Helvetica Neue"/>
@@ -348,7 +348,7 @@
         </w:rPr>
       </w:r>
     </w:p>
-    <w:p>
+    <w:p ns1:paraId="00000012">
       <w:pPr>
         <w:rPr>
           <w:rFonts w:ascii="Helvetica Neue" w:cs="Helvetica Neue" w:eastAsia="Helvetica Neue" w:hAnsi="Helvetica Neue"/>
@@ -360,7 +360,7 @@
         </w:rPr>
       </w:r>
     </w:p>
-    <w:p>
+    <w:p ns1:paraId="00000013">
       <w:pPr>
         <w:rPr>
           <w:rFonts w:ascii="Helvetica Neue" w:cs="Helvetica Neue" w:eastAsia="Helvetica Neue" w:hAnsi="Helvetica Neue"/>
@@ -372,7 +372,7 @@
         </w:rPr>
       </w:r>
     </w:p>
-    <w:p>
+    <w:p ns1:paraId="00000014">
       <w:pPr>
         <w:rPr>
           <w:rFonts w:ascii="Helvetica Neue" w:cs="Helvetica Neue" w:eastAsia="Helvetica Neue" w:hAnsi="Helvetica Neue"/>
@@ -417,9 +417,9 @@
           <w:tcPr/>
           <w:p>
             <w:r>
-              <w:t>STATUS</w:t>
+              <w:t>STATUS · MVP local validado</w:t>
               <w:br/>
-              <w:t>Proposed</w:t>
+              <w:t/>
             </w:r>
           </w:p>
         </w:tc>
@@ -449,15 +449,15 @@
           <w:tcPr/>
           <w:p>
             <w:r>
-              <w:t>LAST UPDATED</w:t>
+              <w:t>LAST UPDATED · 05/10/2026</w:t>
               <w:br/>
-              <w:t>September 22, 2026</w:t>
+              <w:t/>
             </w:r>
           </w:p>
         </w:tc>
       </w:tr>
     </w:tbl>
-    <w:p>
+    <w:p ns1:paraId="0000001D">
       <w:pPr>
         <w:spacing w:after="110" w:line="300" w:lineRule="auto"/>
         <w:rPr>
@@ -582,7 +582,7 @@
           </w:tcPr>
           <w:p>
             <w:r>
-              <w:t>Especialistas do projeto e banca I2A2</w:t>
+              <w:t>Revisão especializada de precisão pendente</w:t>
             </w:r>
           </w:p>
         </w:tc>
@@ -678,7 +678,7 @@
         </w:tc>
       </w:tr>
     </w:tbl>
-    <w:p>
+    <w:p ns1:paraId="00000026">
       <w:pPr>
         <w:pStyle w:val="Heading1"/>
         <w:pBdr>
@@ -697,7 +697,7 @@
         <w:t>1. Abstract</w:t>
       </w:r>
     </w:p>
-    <w:p>
+    <w:p ns1:paraId="00000027">
       <w:pPr>
         <w:spacing w:after="110" w:line="300" w:lineRule="auto"/>
         <w:jc w:val="both"/>
@@ -709,7 +709,7 @@
         <w:t>O InsurMinds é um MVP local que recebe apólices D&amp;O em PDF ou imagem, extrai texto e evidências com o Google Gemini, estrutura 16 campos relevantes e permite comparar duas ou mais apólices. A arquitetura separa recepção, leitura documental, extração multimodal, validação, persistência, consulta e comparação determinística.</w:t>
       </w:r>
     </w:p>
-    <w:p>
+    <w:p ns1:paraId="00000028">
       <w:pPr>
         <w:spacing w:after="110" w:line="300" w:lineRule="auto"/>
         <w:jc w:val="both"/>
@@ -718,10 +718,10 @@
         </w:rPr>
       </w:pPr>
       <w:r>
-        <w:t>O sistema atende uma demonstração acadêmica com documentos de até 20 páginas digitalizadas e 220 mil caracteres por documento. Ele não substitui análise jurídica, não recomenda contratação e não promete cobertura completa de condições contratuais. A evidência citada pelo modelo é verificada localmente antes de ser exibida.</w:t>
-      </w:r>
-    </w:p>
-    <w:p>
+        <w:t>Limites: 20 MB, 300 páginas e 2 milhões de caracteres. O processamento usa blocos de até 60 mil caracteres, 20 páginas e 4 imagens. Evidências textuais são verificadas localmente; interpretações e leituras visuais exigem revisão humana.</w:t>
+      </w:r>
+    </w:p>
+    <w:p ns1:paraId="00000029">
       <w:pPr>
         <w:spacing w:after="0" w:line="120" w:lineRule="auto"/>
         <w:jc w:val="both"/>
@@ -735,7 +735,7 @@
         </w:rPr>
       </w:r>
     </w:p>
-    <w:p>
+    <w:p ns1:paraId="0000002A">
       <w:pPr>
         <w:pStyle w:val="Heading1"/>
         <w:rPr>
@@ -1039,7 +1039,7 @@
         </w:tc>
       </w:tr>
     </w:tbl>
-    <w:p>
+    <w:p ns1:paraId="00000035">
       <w:pPr>
         <w:pStyle w:val="Heading1"/>
         <w:spacing w:before="0" w:line="216" w:lineRule="auto"/>
@@ -1054,7 +1054,7 @@
         </w:rPr>
       </w:r>
     </w:p>
-    <w:p>
+    <w:p ns1:paraId="00000036">
       <w:pPr>
         <w:pStyle w:val="Heading1"/>
         <w:rPr>
@@ -1065,7 +1065,7 @@
         <w:t>3. Background and Problem Statement</w:t>
       </w:r>
     </w:p>
-    <w:p>
+    <w:p ns1:paraId="00000037">
       <w:pPr>
         <w:spacing w:after="110" w:line="300" w:lineRule="auto"/>
         <w:jc w:val="both"/>
@@ -1074,10 +1074,10 @@
         </w:rPr>
       </w:pPr>
       <w:r>
-        <w:t>Apólices D&amp;O são extensas, heterogêneas e redigidas em linguagem jurídica. A comparação manual de limites, franquias, coberturas, exclusões e condições consome horas e dificulta a rastreabilidade entre uma conclusão e a página de origem.</w:t>
-      </w:r>
-    </w:p>
-    <w:p>
+        <w:t>Apólices D&amp;O são extensas, heterogêneas e redigidas em linguagem jurídica. Comparar limites, franquias, coberturas e exclusões exige rastrear cada condição até sua página de origem.</w:t>
+      </w:r>
+    </w:p>
+    <w:p ns1:paraId="00000038">
       <w:pPr>
         <w:spacing w:after="110" w:line="300" w:lineRule="auto"/>
         <w:jc w:val="both"/>
@@ -1090,23 +1090,25 @@
         <w:t>O sistema delimita o problema à análise assistida de documentos fornecidos pelo usuário. A IA interpreta o conteúdo, mas a aplicação mantém a fonte, a página e o trecho citado como evidência. A comparação é determinística para evitar conclusões inventadas.</w:t>
       </w:r>
     </w:p>
-    <w:p>
+    <w:p ns1:paraId="00000039">
       <w:pPr>
         <w:pStyle w:val="Heading1"/>
         <w:rPr>
           <w:rFonts w:ascii="Helvetica Neue" w:cs="Helvetica Neue" w:eastAsia="Helvetica Neue" w:hAnsi="Helvetica Neue"/>
         </w:rPr>
+        <w:keepNext/>
       </w:pPr>
       <w:r>
         <w:t>4. Proposed Architecture</w:t>
       </w:r>
     </w:p>
-    <w:p>
+    <w:p ns1:paraId="0000003A">
       <w:pPr>
         <w:spacing w:after="0" w:line="144" w:lineRule="auto"/>
         <w:rPr>
           <w:rFonts w:ascii="Helvetica Neue" w:cs="Helvetica Neue" w:eastAsia="Helvetica Neue" w:hAnsi="Helvetica Neue"/>
         </w:rPr>
+        <w:keepNext/>
       </w:pPr>
       <w:r>
         <w:rPr>
@@ -1114,47 +1116,48 @@
         </w:rPr>
       </w:r>
     </w:p>
-    <w:p>
-      <w:pPr>
-        <w:rPr>
-          <w:rFonts w:ascii="Helvetica Neue" w:cs="Helvetica Neue" w:eastAsia="Helvetica Neue" w:hAnsi="Helvetica Neue"/>
-        </w:rPr>
+    <w:p ns1:paraId="0000003B">
+      <w:pPr>
+        <w:rPr>
+          <w:rFonts w:ascii="Helvetica Neue" w:cs="Helvetica Neue" w:eastAsia="Helvetica Neue" w:hAnsi="Helvetica Neue"/>
+        </w:rPr>
+        <w:keepNext/>
       </w:pPr>
       <w:r>
         <w:rPr>
           <w:rFonts w:ascii="Helvetica Neue" w:cs="Helvetica Neue" w:eastAsia="Helvetica Neue" w:hAnsi="Helvetica Neue"/>
         </w:rPr>
         <w:drawing>
-          <wp:inline distB="0" distT="0" distL="0" distR="0">
-            <wp:extent cx="6126480" cy="3139821"/>
-            <wp:effectExtent b="0" l="0" r="0" t="0"/>
-            <wp:docPr id="1" name="image1.png"/>
-            <a:graphic>
-              <a:graphicData uri="http://schemas.openxmlformats.org/drawingml/2006/picture">
-                <pic:pic>
-                  <pic:nvPicPr>
-                    <pic:cNvPr id="0" name="image1.png"/>
-                    <pic:cNvPicPr preferRelativeResize="0"/>
-                  </pic:nvPicPr>
-                  <pic:blipFill>
-                    <a:blip r:embed="rId8"/>
-                    <a:srcRect b="0" l="0" r="0" t="0"/>
-                    <a:stretch>
-                      <a:fillRect/>
-                    </a:stretch>
-                  </pic:blipFill>
-                  <pic:spPr>
-                    <a:xfrm>
-                      <a:off x="0" y="0"/>
-                      <a:ext cx="6126480" cy="3139821"/>
-                    </a:xfrm>
-                    <a:prstGeom prst="rect"/>
-                    <a:ln/>
-                  </pic:spPr>
-                </pic:pic>
-              </a:graphicData>
-            </a:graphic>
-          </wp:inline>
+          <ns2:inline distB="0" distT="0" distL="0" distR="0">
+            <ns2:extent cx="6126480" cy="3139821"/>
+            <ns2:effectExtent b="0" l="0" r="0" t="0"/>
+            <ns2:docPr id="1" name="image1.png"/>
+            <ns3:graphic>
+              <ns3:graphicData uri="http://schemas.openxmlformats.org/drawingml/2006/picture">
+                <ns4:pic>
+                  <ns4:nvPicPr>
+                    <ns4:cNvPr id="0" name="image1.png"/>
+                    <ns4:cNvPicPr preferRelativeResize="0"/>
+                  </ns4:nvPicPr>
+                  <ns4:blipFill>
+                    <ns3:blip ns5:embed="rId8"/>
+                    <ns3:srcRect b="0" l="0" r="0" t="0"/>
+                    <ns3:stretch>
+                      <ns3:fillRect/>
+                    </ns3:stretch>
+                  </ns4:blipFill>
+                  <ns4:spPr>
+                    <ns3:xfrm>
+                      <ns3:off x="0" y="0"/>
+                      <ns3:ext cx="6126480" cy="3139821"/>
+                    </ns3:xfrm>
+                    <ns3:prstGeom prst="rect"/>
+                    <ns3:ln/>
+                  </ns4:spPr>
+                </ns4:pic>
+              </ns3:graphicData>
+            </ns3:graphic>
+          </ns2:inline>
         </w:drawing>
       </w:r>
       <w:r>
@@ -1163,7 +1166,7 @@
         </w:rPr>
       </w:r>
     </w:p>
-    <w:p>
+    <w:p ns1:paraId="0000003C">
       <w:pPr>
         <w:keepNext w:val="0"/>
         <w:keepLines w:val="0"/>
@@ -1189,7 +1192,7 @@
         <w:t>Figura 1. Arquitetura do InsurMinds.</w:t>
       </w:r>
     </w:p>
-    <w:p>
+    <w:p ns1:paraId="0000003D">
       <w:pPr>
         <w:keepNext w:val="0"/>
         <w:keepLines w:val="0"/>
@@ -1217,7 +1220,7 @@
         </w:rPr>
       </w:r>
     </w:p>
-    <w:p>
+    <w:p ns1:paraId="0000003E">
       <w:pPr>
         <w:pStyle w:val="Heading3"/>
         <w:spacing w:after="90" w:line="280" w:lineRule="auto"/>
@@ -1227,7 +1230,7 @@
         <w:t>Core components</w:t>
       </w:r>
     </w:p>
-    <w:p>
+    <w:p ns1:paraId="0000003F">
       <w:pPr>
         <w:spacing w:after="0" w:before="20" w:line="240" w:lineRule="auto"/>
         <w:rPr>
@@ -1723,7 +1726,7 @@
           </w:tcPr>
           <w:p>
             <w:r>
-              <w:t>Extrai JSON estruturado com evidência.</w:t>
+              <w:t>Extrai JSON por bloco; retoma checkpoints.</w:t>
             </w:r>
           </w:p>
         </w:tc>
@@ -1746,7 +1749,7 @@
           </w:tcPr>
           <w:p>
             <w:r>
-              <w:t>Google Gemini API</w:t>
+              <w:t>Checkpoints locais / API Gemini</w:t>
             </w:r>
           </w:p>
         </w:tc>
@@ -1874,7 +1877,7 @@
         </w:tc>
       </w:tr>
     </w:tbl>
-    <w:p>
+    <w:p ns1:paraId="00000058">
       <w:pPr>
         <w:pStyle w:val="Heading1"/>
         <w:spacing w:before="0" w:line="120" w:lineRule="auto"/>
@@ -1889,7 +1892,7 @@
         </w:rPr>
       </w:r>
     </w:p>
-    <w:p>
+    <w:p ns1:paraId="00000059">
       <w:pPr>
         <w:pStyle w:val="Heading1"/>
         <w:spacing w:before="0" w:line="120" w:lineRule="auto"/>
@@ -1904,18 +1907,19 @@
         </w:rPr>
       </w:r>
     </w:p>
-    <w:p>
+    <w:p ns1:paraId="0000005A">
       <w:pPr>
         <w:pStyle w:val="Heading1"/>
         <w:rPr>
           <w:rFonts w:ascii="Helvetica Neue" w:cs="Helvetica Neue" w:eastAsia="Helvetica Neue" w:hAnsi="Helvetica Neue"/>
         </w:rPr>
+        <w:keepNext/>
       </w:pPr>
       <w:r>
         <w:t>5. Request Lifecycle</w:t>
       </w:r>
     </w:p>
-    <w:p>
+    <w:p ns1:paraId="0000005B">
       <w:pPr>
         <w:keepNext w:val="0"/>
         <w:keepLines w:val="0"/>
@@ -1944,7 +1948,7 @@
         <w:t>O usuário envia um PDF, PNG, JPG ou WebP pela interface React. A API Starlette valida o tipo, limita tamanho e páginas, salva o arquivo e cria o registro de análise.</w:t>
       </w:r>
     </w:p>
-    <w:p>
+    <w:p ns1:paraId="0000005C">
       <w:pPr>
         <w:keepNext w:val="0"/>
         <w:keepLines w:val="0"/>
@@ -1970,10 +1974,10 @@
         </w:rPr>
       </w:pPr>
       <w:r>
-        <w:t>A borda valida MIME, conteúdo legível, PDF protegido, páginas vazias e limites do MVP. A aplicação local não possui autenticação ou isolamento multiusuário e deve permanecer em ambiente controlado.</w:t>
-      </w:r>
-    </w:p>
-    <w:p>
+        <w:t>A recepção valida conteúdo, tamanho, PDF criptografado e limites. A aplicação deve operar em loopback, sem autenticação ou isolamento multiusuário.</w:t>
+      </w:r>
+    </w:p>
+    <w:p ns1:paraId="0000005D">
       <w:pPr>
         <w:keepNext w:val="0"/>
         <w:keepLines w:val="0"/>
@@ -2002,7 +2006,7 @@
         <w:t>O leitor documental converte páginas em texto quando possível e renderiza imagens para páginas escaneadas. O pipeline monta uma entrada multimodal com o número de cada página e seus dados visuais.</w:t>
       </w:r>
     </w:p>
-    <w:p>
+    <w:p ns1:paraId="0000005E">
       <w:pPr>
         <w:keepNext w:val="0"/>
         <w:keepLines w:val="0"/>
@@ -2028,10 +2032,10 @@
         </w:rPr>
       </w:pPr>
       <w:r>
-        <w:t>Uma chamada ao Gemini 3.6 Flash retorna JSON estruturado com classificação, título, fatos, trechos, páginas e alertas. Pydantic valida o contrato e a aplicação confere se o trecho existe na página informada.</w:t>
-      </w:r>
-    </w:p>
-    <w:p>
+        <w:t>Cada bloco é enviado ao Gemini 3.8 Flash. Pydantic valida a estrutura e o verificador confere as citações nas páginas originais. A consolidação preserva múltiplas evidências e valores divergentes em variants, com needs_review.</w:t>
+      </w:r>
+    </w:p>
+    <w:p ns1:paraId="0000005F">
       <w:pPr>
         <w:keepNext w:val="0"/>
         <w:keepLines w:val="0"/>
@@ -2060,7 +2064,7 @@
         <w:t>O estado da análise e seus fatos são gravados no SQLite antes de a interface exibir o resultado. O arquivo original permanece em data/ para permitir auditoria e abertura da evidência.</w:t>
       </w:r>
     </w:p>
-    <w:p>
+    <w:p ns1:paraId="00000060">
       <w:pPr>
         <w:keepNext w:val="0"/>
         <w:keepLines w:val="0"/>
@@ -2086,10 +2090,10 @@
         </w:rPr>
       </w:pPr>
       <w:r>
-        <w:t>Falhas do provedor, resposta inválida e limites excedidos levam a estado de erro recuperável. O cliente usa timeout amplo e oferece reprocessamento explícito.</w:t>
-      </w:r>
-    </w:p>
-    <w:p>
+        <w:t>Timeout de 90 segundos, até três tentativas por modelo, espera exponencial e intervalo mínimo de 15 segundos. Fallback para Gemini 3.7 em indisponibilidade, sem contornar cotas. Checkpoints atômicos permitem retomar blocos concluídos.</w:t>
+      </w:r>
+    </w:p>
+    <w:p ns1:paraId="00000061">
       <w:pPr>
         <w:keepNext w:val="0"/>
         <w:keepLines w:val="0"/>
@@ -2118,7 +2122,7 @@
         <w:t>Ao concluir, a API retorna fatos, alertas e páginas de evidência. A interface permite consulta contextual, comparação, abertura do trecho de origem e exportação em PDF ou JSON.</w:t>
       </w:r>
     </w:p>
-    <w:p>
+    <w:p ns1:paraId="00000062">
       <w:pPr>
         <w:pStyle w:val="Heading1"/>
         <w:spacing w:before="0" w:line="168" w:lineRule="auto"/>
@@ -2133,7 +2137,7 @@
         </w:rPr>
       </w:r>
     </w:p>
-    <w:p>
+    <w:p ns1:paraId="00000063">
       <w:pPr>
         <w:pStyle w:val="Heading1"/>
         <w:rPr>
@@ -2144,7 +2148,7 @@
         <w:t>6. API and Data Contracts</w:t>
       </w:r>
     </w:p>
-    <w:p>
+    <w:p ns1:paraId="00000064">
       <w:pPr>
         <w:pStyle w:val="Heading3"/>
         <w:spacing w:after="90" w:line="280" w:lineRule="auto"/>
@@ -2154,7 +2158,7 @@
         <w:t>Primary data contract</w:t>
       </w:r>
     </w:p>
-    <w:p>
+    <w:p ns1:paraId="00000065">
       <w:pPr>
         <w:spacing w:after="0" w:line="192" w:lineRule="auto"/>
         <w:rPr>
@@ -2497,7 +2501,7 @@
           </w:tcPr>
           <w:p>
             <w:r>
-              <w:t>do, uncertain ou other.</w:t>
+              <w:t>do_policy, uncertain ou other.</w:t>
             </w:r>
           </w:p>
         </w:tc>
@@ -2791,7 +2795,7 @@
           </w:tcPr>
           <w:p>
             <w:r>
-              <w:t>Trecho literal de suporte.</w:t>
+              <w:t>Primeira citação; evidence contém todas as referências.</w:t>
             </w:r>
           </w:p>
         </w:tc>
@@ -2889,7 +2893,7 @@
           </w:tcPr>
           <w:p>
             <w:r>
-              <w:t>Página de origem.</w:t>
+              <w:t>Página original da primeira referência.</w:t>
             </w:r>
           </w:p>
         </w:tc>
@@ -2993,7 +2997,7 @@
         </w:tc>
       </w:tr>
     </w:tbl>
-    <w:p>
+    <w:p ns1:paraId="00000086">
       <w:pPr>
         <w:spacing w:after="0" w:line="192" w:lineRule="auto"/>
         <w:rPr>
@@ -3008,17 +3012,18 @@
         </w:rPr>
       </w:r>
     </w:p>
-    <w:p>
+    <w:p ns1:paraId="00000087">
       <w:pPr>
         <w:pStyle w:val="Heading3"/>
         <w:spacing w:after="90" w:line="280" w:lineRule="auto"/>
         <w:rPr/>
+        <w:keepNext/>
       </w:pPr>
       <w:r>
         <w:t>Contract guarantees</w:t>
       </w:r>
     </w:p>
-    <w:p>
+    <w:p ns1:paraId="00000088">
       <w:pPr>
         <w:spacing w:after="0" w:line="192" w:lineRule="auto"/>
         <w:rPr>
@@ -3026,6 +3031,7 @@
           <w:sz w:val="16"/>
           <w:szCs w:val="16"/>
         </w:rPr>
+        <w:keepNext/>
       </w:pPr>
       <w:r>
         <w:rPr>
@@ -3033,7 +3039,7 @@
         </w:rPr>
       </w:r>
     </w:p>
-    <w:p>
+    <w:p ns1:paraId="00000089">
       <w:pPr>
         <w:keepNext w:val="0"/>
         <w:keepLines w:val="0"/>
@@ -3062,7 +3068,7 @@
         <w:t>Nenhum fato com valor é exibido como verificado sem quote, page e correspondência local na página. Evidências exclusivamente visuais recebem visual_review e exigem conferência humana.</w:t>
       </w:r>
     </w:p>
-    <w:p>
+    <w:p ns1:paraId="0000008A">
       <w:pPr>
         <w:keepNext w:val="0"/>
         <w:keepLines w:val="0"/>
@@ -3088,10 +3094,10 @@
         </w:rPr>
       </w:pPr>
       <w:r>
-        <w:t>Cada análise possui UUID e estados queued, processing, completed ou error. A comparação referencia IDs persistidos e ordena critérios por um catálogo estável de 16 campos.</w:t>
-      </w:r>
-    </w:p>
-    <w:p>
+        <w:t>Estados: queued, reading, extracting, ready e error. Comparações preservam uma fotografia dos fatos e usam um catálogo estável de 16 campos.</w:t>
+      </w:r>
+    </w:p>
+    <w:p ns1:paraId="0000008B">
       <w:pPr>
         <w:keepNext w:val="0"/>
         <w:keepLines w:val="0"/>
@@ -3117,10 +3123,10 @@
         </w:rPr>
       </w:pPr>
       <w:r>
-        <w:t>O registro captura nome do arquivo, MIME, caminho, modelo, data, páginas, fatos e warnings para permitir auditoria e reprodução.</w:t>
-      </w:r>
-    </w:p>
-    <w:p>
+        <w:t>O registro guarda modelo configurado, models_used, progresso completed_chunks/total_chunks/cached_chunks, páginas, fatos, variants, needs_review e avisos.</w:t>
+      </w:r>
+    </w:p>
+    <w:p ns1:paraId="0000008C">
       <w:pPr>
         <w:keepNext w:val="0"/>
         <w:keepLines w:val="0"/>
@@ -3149,7 +3155,7 @@
         <w:t>O JSON estruturado é a fonte da aplicação para a demonstração, não uma interpretação jurídica definitiva nem prova de cobertura contratada.</w:t>
       </w:r>
     </w:p>
-    <w:p>
+    <w:p ns1:paraId="0000008D">
       <w:pPr>
         <w:spacing w:after="110" w:line="300" w:lineRule="auto"/>
         <w:rPr>
@@ -3160,7 +3166,7 @@
         <w:t>A definição versionada do contrato é publicada em</w:t>
       </w:r>
     </w:p>
-    <w:p>
+    <w:p ns1:paraId="0000008E">
       <w:pPr>
         <w:spacing w:after="110" w:line="300" w:lineRule="auto"/>
         <w:rPr>
@@ -3171,7 +3177,7 @@
         <w:t>backend/models.py e na documentação do repositório.</w:t>
       </w:r>
     </w:p>
-    <w:p>
+    <w:p ns1:paraId="0000008F">
       <w:pPr>
         <w:pStyle w:val="Heading1"/>
         <w:spacing w:before="0" w:line="120" w:lineRule="auto"/>
@@ -3186,7 +3192,7 @@
         </w:rPr>
       </w:r>
     </w:p>
-    <w:p>
+    <w:p ns1:paraId="00000090">
       <w:pPr>
         <w:pStyle w:val="Heading1"/>
         <w:rPr>
@@ -3197,7 +3203,7 @@
         <w:t>7. Consistency, Idempotency, and Replay</w:t>
       </w:r>
     </w:p>
-    <w:p>
+    <w:p ns1:paraId="00000091">
       <w:pPr>
         <w:spacing w:after="0" w:line="96" w:lineRule="auto"/>
         <w:rPr>
@@ -3210,7 +3216,7 @@
         </w:rPr>
       </w:r>
     </w:p>
-    <w:p>
+    <w:p ns1:paraId="00000092">
       <w:pPr>
         <w:spacing w:after="110" w:line="300" w:lineRule="auto"/>
         <w:jc w:val="both"/>
@@ -3219,7 +3225,7 @@
         </w:rPr>
       </w:pPr>
       <w:r>
-        <w:t>O carregamento dos exemplos é idempotente por título. Uploads reais recebem novo UUID. A comparação é função determinística dos fatos persistidos; se a extração falhar, nenhuma comparação parcial é promovida a resultado concluído.</w:t>
+        <w:t>Exemplos são idempotentes por IDs fixos. Uploads recebem UUID; blocos já concluídos podem ser reutilizados por hash de conteúdo, prompt, schema e modelos. A comparação é determinística e não considera a numeração da página ao comparar valores.</w:t>
       </w:r>
     </w:p>
     <w:tbl>
@@ -3381,7 +3387,7 @@
           </w:tcPr>
           <w:p>
             <w:r>
-              <w:t>Novo UUID e novo processamento.</w:t>
+              <w:t>Novo UUID; reutiliza checkpoints compatíveis.</w:t>
             </w:r>
           </w:p>
         </w:tc>
@@ -3456,7 +3462,7 @@
           </w:tcPr>
           <w:p>
             <w:r>
-              <w:t>Estado error e retry explícito.</w:t>
+              <w:t>Retries, fallback e retomada; error se esgotados.</w:t>
             </w:r>
           </w:p>
         </w:tc>
@@ -3606,7 +3612,7 @@
           </w:tcPr>
           <w:p>
             <w:r>
-              <w:t>A análise guarda o modelo usado.</w:t>
+              <w:t>Registra models_used e invalida checkpoints incompatíveis.</w:t>
             </w:r>
           </w:p>
         </w:tc>
@@ -3635,7 +3641,7 @@
         </w:tc>
       </w:tr>
     </w:tbl>
-    <w:p>
+    <w:p ns1:paraId="000000A2">
       <w:pPr>
         <w:pStyle w:val="Heading1"/>
         <w:spacing w:before="0" w:line="269" w:lineRule="auto"/>
@@ -3650,7 +3656,7 @@
         </w:rPr>
       </w:r>
     </w:p>
-    <w:p>
+    <w:p ns1:paraId="000000A3">
       <w:pPr>
         <w:pStyle w:val="Heading1"/>
         <w:rPr>
@@ -3661,7 +3667,7 @@
         <w:t>8. Security and Privacy Considerations</w:t>
       </w:r>
     </w:p>
-    <w:p>
+    <w:p ns1:paraId="000000A4">
       <w:pPr>
         <w:spacing w:after="0" w:line="96" w:lineRule="auto"/>
         <w:rPr>
@@ -3674,7 +3680,7 @@
         </w:rPr>
       </w:r>
     </w:p>
-    <w:p>
+    <w:p ns1:paraId="000000A5">
       <w:pPr>
         <w:keepNext w:val="0"/>
         <w:keepLines w:val="0"/>
@@ -3703,7 +3709,7 @@
         <w:t>A versão acadêmica não implementa autenticação, autorização ou tenancy. Uma implantação pública deve adicionar identidade e segregação por usuário.</w:t>
       </w:r>
     </w:p>
-    <w:p>
+    <w:p ns1:paraId="000000A6">
       <w:pPr>
         <w:keepNext w:val="0"/>
         <w:keepLines w:val="0"/>
@@ -3732,7 +3738,7 @@
         <w:t>Documentos podem conter dados pessoais e informações corporativas sensíveis. O MVP evita registrar conteúdo integral em logs e mantém arquivos no diretório data/.</w:t>
       </w:r>
     </w:p>
-    <w:p>
+    <w:p ns1:paraId="000000A7">
       <w:pPr>
         <w:keepNext w:val="0"/>
         <w:keepLines w:val="0"/>
@@ -3758,10 +3764,10 @@
         </w:rPr>
       </w:pPr>
       <w:r>
-        <w:t>A chave GEMINI_API_KEY é lida somente do ambiente do servidor e não deve ser colocada no frontend, no README ou no Git. O modelo é configurável por GEMINI_MODEL.</w:t>
-      </w:r>
-    </w:p>
-    <w:p>
+        <w:t>GEMINI_API_KEY permanece no servidor. GEMINI_MODEL define o modelo principal e GEMINI_FALLBACK_MODELS define as alternativas. O ZIP e o Git excluem .env, data e documentos privados.</w:t>
+      </w:r>
+    </w:p>
+    <w:p ns1:paraId="000000A8">
       <w:pPr>
         <w:keepNext w:val="0"/>
         <w:keepLines w:val="0"/>
@@ -3790,7 +3796,7 @@
         <w:t>Endpoints de reprocessamento, exportação e carga de exemplos devem permanecer protegidos em qualquer exposição pública. Limites de páginas, caracteres e MIME são defaults de segurança e custo.</w:t>
       </w:r>
     </w:p>
-    <w:p>
+    <w:p ns1:paraId="000000A9">
       <w:pPr>
         <w:keepNext w:val="0"/>
         <w:keepLines w:val="0"/>
@@ -3819,7 +3825,7 @@
         <w:t>A retenção atual é local e indefinida até exclusão manual. Uma evolução deve definir prazo, exclusão segura, criptografia, residência e auditoria.</w:t>
       </w:r>
     </w:p>
-    <w:p>
+    <w:p ns1:paraId="000000AA">
       <w:pPr>
         <w:keepNext w:val="0"/>
         <w:keepLines w:val="0"/>
@@ -3856,7 +3862,7 @@
         </w:rPr>
       </w:r>
     </w:p>
-    <w:p>
+    <w:p ns1:paraId="000000AB">
       <w:pPr>
         <w:keepNext w:val="0"/>
         <w:keepLines w:val="0"/>
@@ -3893,7 +3899,7 @@
         </w:rPr>
       </w:r>
     </w:p>
-    <w:p>
+    <w:p ns1:paraId="000000AC">
       <w:pPr>
         <w:pStyle w:val="Heading1"/>
         <w:rPr>
@@ -4563,7 +4569,7 @@
         </w:tc>
       </w:tr>
     </w:tbl>
-    <w:p>
+    <w:p ns1:paraId="000000C9">
       <w:pPr>
         <w:pStyle w:val="Heading1"/>
         <w:spacing w:before="0" w:lineRule="auto"/>
@@ -4578,7 +4584,7 @@
         </w:rPr>
       </w:r>
     </w:p>
-    <w:p>
+    <w:p ns1:paraId="000000CA">
       <w:pPr>
         <w:pStyle w:val="Heading1"/>
         <w:rPr>
@@ -4589,7 +4595,7 @@
         <w:t>10. Alternatives Considered</w:t>
       </w:r>
     </w:p>
-    <w:p>
+    <w:p ns1:paraId="000000CB">
       <w:pPr>
         <w:spacing w:after="0" w:line="14.399999999999999" w:lineRule="auto"/>
         <w:rPr>
@@ -4602,7 +4608,7 @@
         </w:rPr>
       </w:r>
     </w:p>
-    <w:p>
+    <w:p ns1:paraId="000000CC">
       <w:pPr>
         <w:spacing w:after="0" w:line="192" w:lineRule="auto"/>
         <w:rPr>
@@ -5028,7 +5034,7 @@
         </w:tc>
       </w:tr>
     </w:tbl>
-    <w:p>
+    <w:p ns1:paraId="000000DC">
       <w:pPr>
         <w:pStyle w:val="Heading1"/>
         <w:spacing w:before="0" w:line="269" w:lineRule="auto"/>
@@ -5043,7 +5049,7 @@
         </w:rPr>
       </w:r>
     </w:p>
-    <w:p>
+    <w:p ns1:paraId="000000DD">
       <w:pPr>
         <w:pStyle w:val="Heading1"/>
         <w:rPr>
@@ -5054,7 +5060,7 @@
         <w:t>11. Open Questions</w:t>
       </w:r>
     </w:p>
-    <w:p>
+    <w:p ns1:paraId="000000DE">
       <w:pPr>
         <w:keepNext w:val="0"/>
         <w:keepLines w:val="0"/>
@@ -5083,7 +5089,7 @@
         <w:t>Qual provedor de OCR e modelo deve ser homologado para documentos reais em produção?</w:t>
       </w:r>
     </w:p>
-    <w:p>
+    <w:p ns1:paraId="000000DF">
       <w:pPr>
         <w:keepNext w:val="0"/>
         <w:keepLines w:val="0"/>
@@ -5112,7 +5118,7 @@
         <w:t>Quais campos e regras jurídicas devem receber revisão obrigatória de especialista?</w:t>
       </w:r>
     </w:p>
-    <w:p>
+    <w:p ns1:paraId="000000E0">
       <w:pPr>
         <w:keepNext w:val="0"/>
         <w:keepLines w:val="0"/>
@@ -5141,7 +5147,7 @@
         <w:t>A solução deve permanecer local ou evoluir para nuvem com isolamento por organização?</w:t>
       </w:r>
     </w:p>
-    <w:p>
+    <w:p ns1:paraId="000000E1">
       <w:pPr>
         <w:keepNext w:val="0"/>
         <w:keepLines w:val="0"/>
@@ -5170,7 +5176,7 @@
         <w:t>Qual política de retenção e controle de acesso será exigida para apólices reais?</w:t>
       </w:r>
     </w:p>
-    <w:p>
+    <w:p ns1:paraId="000000E2">
       <w:pPr>
         <w:pStyle w:val="Heading1"/>
         <w:spacing w:before="0" w:lineRule="auto"/>
@@ -5185,7 +5191,7 @@
         </w:rPr>
       </w:r>
     </w:p>
-    <w:p>
+    <w:p ns1:paraId="000000E3">
       <w:pPr>
         <w:pStyle w:val="Heading1"/>
         <w:rPr>
@@ -5196,7 +5202,7 @@
         <w:t>12. Decision and Next Steps</w:t>
       </w:r>
     </w:p>
-    <w:p>
+    <w:p ns1:paraId="000000E4">
       <w:pPr>
         <w:spacing w:after="110" w:line="300" w:lineRule="auto"/>
         <w:jc w:val="both"/>
@@ -5205,7 +5211,7 @@
         </w:rPr>
       </w:pPr>
       <w:r>
-        <w:t>Recomenda-se aprovar o MVP como base demonstrável e iniciar validação com amostra anonimizada. M1 é executar o fluxo real; M2 é comparar extrações com especialistas; M3 é adicionar autenticação, retenção e observabilidade; M4 é avaliar implantação controlada após evidência de precisão, custo e segurança.</w:t>
+        <w:t>Validação funcional concluída com dois PDFs fictícios e Gemini 3.8 Flash: 16 critérios com evidências verificadas por documento, 10 diferenças e exportações PDF/JSON aprovadas. Registro: Validacao_IA_Exemplos.json. Suíte: 32 testes Python e um teste Node, build e QA da interface. A precisão contratual em documentos de mercado permanece sujeita à revisão especializada.</w:t>
       </w:r>
     </w:p>
     <w:tbl>
@@ -5344,7 +5350,7 @@
           </w:tcPr>
           <w:p>
             <w:r>
-              <w:t>M1</w:t>
+              <w:t>M1 concluído</w:t>
             </w:r>
           </w:p>
         </w:tc>
@@ -5367,7 +5373,7 @@
           </w:tcPr>
           <w:p>
             <w:r>
-              <w:t>Documentos reais anonimizados</w:t>
+              <w:t>Dois PDFs fictícios / IA real</w:t>
             </w:r>
           </w:p>
         </w:tc>
@@ -5390,7 +5396,7 @@
           </w:tcPr>
           <w:p>
             <w:r>
-              <w:t>Upload, extração e evidências verificadas</w:t>
+              <w:t>Extração, comparação e exportações aprovadas</w:t>
             </w:r>
           </w:p>
         </w:tc>
@@ -5621,7 +5627,7 @@
         </w:tc>
       </w:tr>
     </w:tbl>
-    <w:p>
+    <w:p ns1:paraId="000000F4">
       <w:pPr>
         <w:spacing w:after="120" w:line="269" w:lineRule="auto"/>
         <w:rPr>
@@ -5635,10 +5641,10 @@
       </w:r>
     </w:p>
     <w:sectPr>
-      <w:headerReference r:id="rId10" w:type="default"/>
-      <w:headerReference r:id="rId11" w:type="first"/>
-      <w:footerReference r:id="rId12" w:type="default"/>
-      <w:footerReference r:id="rId13" w:type="first"/>
+      <w:headerReference ns5:id="rId10" w:type="default"/>
+      <w:headerReference ns5:id="rId11" w:type="first"/>
+      <w:footerReference ns5:id="rId12" w:type="default"/>
+      <w:footerReference ns5:id="rId13" w:type="first"/>
       <w:pgSz w:h="15840" w:w="12240" w:orient="portrait"/>
       <w:pgMar w:bottom="893" w:top="1008" w:left="1008" w:right="1008" w:header="720" w:footer="720"/>
       <w:pgNumType w:start="1"/>
@@ -6157,7 +6163,7 @@
 </file>
 
 <file path=word/styles.xml><?xml version="1.0" encoding="utf-8"?>
-<w:styles xmlns:mc="http://schemas.openxmlformats.org/markup-compatibility/2006" xmlns:o="urn:schemas-microsoft-com:office:office" xmlns:r="http://schemas.openxmlformats.org/officeDocument/2006/relationships" xmlns:m="http://schemas.openxmlformats.org/officeDocument/2006/math" xmlns:v="urn:schemas-microsoft-com:vml" xmlns:wp="http://schemas.openxmlformats.org/drawingml/2006/wordprocessingDrawing" xmlns:w10="urn:schemas-microsoft-com:office:word" xmlns:w="http://schemas.openxmlformats.org/wordprocessingml/2006/main" xmlns:wne="http://schemas.microsoft.com/office/word/2006/wordml" xmlns:sl="http://schemas.openxmlformats.org/schemaLibrary/2006/main" xmlns:a="http://schemas.openxmlformats.org/drawingml/2006/main" xmlns:pic="http://schemas.openxmlformats.org/drawingml/2006/picture" xmlns:c="http://schemas.openxmlformats.org/drawingml/2006/chart" xmlns:lc="http://schemas.openxmlformats.org/drawingml/2006/lockedCanvas" xmlns:dgm="http://schemas.openxmlformats.org/drawingml/2006/diagram" xmlns:wps="http://schemas.microsoft.com/office/word/2010/wordprocessingShape" xmlns:wpg="http://schemas.microsoft.com/office/word/2010/wordprocessingGroup" xmlns:w14="http://schemas.microsoft.com/office/word/2010/wordml" xmlns:w15="http://schemas.microsoft.com/office/word/2012/wordml" xmlns:w16="http://schemas.microsoft.com/office/word/2018/wordml" xmlns:w16cex="http://schemas.microsoft.com/office/word/2018/wordml/cex" xmlns:w16cid="http://schemas.microsoft.com/office/word/2016/wordml/cid" xmlns="http://schemas.microsoft.com/office/tasks/2019/documenttasks" xmlns:cr="http://schemas.microsoft.com/office/comments/2020/reactions">
+<w:styles xmlns:w="http://schemas.openxmlformats.org/wordprocessingml/2006/main">
   <w:docDefaults>
     <w:rPrDefault>
       <w:rPr>
@@ -6204,7 +6210,7 @@
     <w:rPr>
       <w:b w:val="1"/>
       <w:bCs w:val="1"/>
-      <w:color w:val="082a4a"/>
+      <w:color w:val="000000"/>
       <w:sz w:val="27"/>
       <w:szCs w:val="27"/>
     </w:rPr>
@@ -6223,7 +6229,7 @@
       <w:b w:val="1"/>
       <w:bCs w:val="1"/>
       <w:smallCaps w:val="1"/>
-      <w:color w:val="082a4a"/>
+      <w:color w:val="000000"/>
       <w:sz w:val="19"/>
       <w:szCs w:val="19"/>
     </w:rPr>
@@ -6240,7 +6246,7 @@
       <w:rFonts w:ascii="Helvetica Neue" w:cs="Helvetica Neue" w:eastAsia="Helvetica Neue" w:hAnsi="Helvetica Neue"/>
       <w:b w:val="1"/>
       <w:bCs w:val="1"/>
-      <w:color w:val="5b7085"/>
+      <w:color w:val="000000"/>
     </w:rPr>
   </w:style>
   <w:style w:type="paragraph" w:styleId="Heading4">
@@ -6301,7 +6307,7 @@
     <w:rPr>
       <w:b w:val="1"/>
       <w:bCs w:val="1"/>
-      <w:color w:val="082a4a"/>
+      <w:color w:val="000000"/>
       <w:sz w:val="44"/>
       <w:szCs w:val="44"/>
     </w:rPr>

</xml_diff>

<commit_message>
chore: clean project scope and synchronize delivery materials
</commit_message>
<xml_diff>
--- a/Projeto_Final_Artefatos/InsurMinds_System_Design.docx
+++ b/Projeto_Final_Artefatos/InsurMinds_System_Design.docx
@@ -417,7 +417,7 @@
           <w:tcPr/>
           <w:p>
             <w:r>
-              <w:t>STATUS · MVP local validado</w:t>
+              <w:t>STATUS · MVP validado</w:t>
               <w:br/>
               <w:t/>
             </w:r>
@@ -433,9 +433,9 @@
           <w:tcPr/>
           <w:p>
             <w:r>
-              <w:t>OWNER</w:t>
+              <w:t>RESPONSÁVEL · InsurMinds</w:t>
               <w:br/>
-              <w:t>InsurMinds</w:t>
+              <w:t/>
             </w:r>
           </w:p>
         </w:tc>
@@ -449,7 +449,7 @@
           <w:tcPr/>
           <w:p>
             <w:r>
-              <w:t>LAST UPDATED · 05/10/2026</w:t>
+              <w:t>REVISADO EM · 06/10/2026</w:t>
               <w:br/>
               <w:t/>
             </w:r>
@@ -514,7 +514,7 @@
           </w:tcPr>
           <w:p>
             <w:r>
-              <w:t>Authors</w:t>
+              <w:t>Autores</w:t>
             </w:r>
           </w:p>
         </w:tc>
@@ -560,7 +560,7 @@
           </w:tcPr>
           <w:p>
             <w:r>
-              <w:t>Reviewers</w:t>
+              <w:t>Validação</w:t>
             </w:r>
           </w:p>
         </w:tc>
@@ -582,7 +582,7 @@
           </w:tcPr>
           <w:p>
             <w:r>
-              <w:t>Revisão especializada de precisão pendente</w:t>
+              <w:t>Funcional com os PDFs fictícios do projeto</w:t>
             </w:r>
           </w:p>
         </w:tc>
@@ -605,7 +605,7 @@
           </w:tcPr>
           <w:p>
             <w:r>
-              <w:t>Related docs</w:t>
+              <w:t>Documentação</w:t>
             </w:r>
           </w:p>
         </w:tc>
@@ -650,7 +650,7 @@
           </w:tcPr>
           <w:p>
             <w:r>
-              <w:t>Scope</w:t>
+              <w:t>Escopo</w:t>
             </w:r>
           </w:p>
         </w:tc>
@@ -694,7 +694,7 @@
         </w:rPr>
       </w:pPr>
       <w:r>
-        <w:t>1. Abstract</w:t>
+        <w:t>1 Resumo</w:t>
       </w:r>
     </w:p>
     <w:p ns1:paraId="00000027">
@@ -743,7 +743,7 @@
         </w:rPr>
       </w:pPr>
       <w:r>
-        <w:t>2. Goals and Non-Goals</w:t>
+        <w:t>2 Objetivos e escopo</w:t>
       </w:r>
     </w:p>
     <w:tbl>
@@ -799,7 +799,7 @@
               <w:rPr>
                 <w:color w:val="FFFFFF"/>
               </w:rPr>
-              <w:t>Goals</w:t>
+              <w:t>Objetivos</w:t>
             </w:r>
           </w:p>
         </w:tc>
@@ -825,7 +825,7 @@
               <w:rPr>
                 <w:color w:val="FFFFFF"/>
               </w:rPr>
-              <w:t>Non-goals</w:t>
+              <w:t>Fora do escopo</w:t>
             </w:r>
           </w:p>
         </w:tc>
@@ -1062,7 +1062,7 @@
         </w:rPr>
       </w:pPr>
       <w:r>
-        <w:t>3. Background and Problem Statement</w:t>
+        <w:t>3 Contexto e problema</w:t>
       </w:r>
     </w:p>
     <w:p ns1:paraId="00000037">
@@ -1096,10 +1096,10 @@
         <w:rPr>
           <w:rFonts w:ascii="Helvetica Neue" w:cs="Helvetica Neue" w:eastAsia="Helvetica Neue" w:hAnsi="Helvetica Neue"/>
         </w:rPr>
-        <w:keepNext/>
-      </w:pPr>
-      <w:r>
-        <w:t>4. Proposed Architecture</w:t>
+        <w:keepNext w:val="1"/>
+      </w:pPr>
+      <w:r>
+        <w:t>4 Arquitetura</w:t>
       </w:r>
     </w:p>
     <w:p ns1:paraId="0000003A">
@@ -1108,7 +1108,7 @@
         <w:rPr>
           <w:rFonts w:ascii="Helvetica Neue" w:cs="Helvetica Neue" w:eastAsia="Helvetica Neue" w:hAnsi="Helvetica Neue"/>
         </w:rPr>
-        <w:keepNext/>
+        <w:keepNext w:val="1"/>
       </w:pPr>
       <w:r>
         <w:rPr>
@@ -1121,7 +1121,7 @@
         <w:rPr>
           <w:rFonts w:ascii="Helvetica Neue" w:cs="Helvetica Neue" w:eastAsia="Helvetica Neue" w:hAnsi="Helvetica Neue"/>
         </w:rPr>
-        <w:keepNext/>
+        <w:keepNext w:val="1"/>
       </w:pPr>
       <w:r>
         <w:rPr>
@@ -1227,7 +1227,7 @@
         <w:rPr/>
       </w:pPr>
       <w:r>
-        <w:t>Core components</w:t>
+        <w:t>Componentes</w:t>
       </w:r>
     </w:p>
     <w:p ns1:paraId="0000003F">
@@ -1302,7 +1302,7 @@
               <w:rPr>
                 <w:color w:val="FFFFFF"/>
               </w:rPr>
-              <w:t>Component</w:t>
+              <w:t>Componente</w:t>
             </w:r>
           </w:p>
         </w:tc>
@@ -1328,7 +1328,7 @@
               <w:rPr>
                 <w:color w:val="FFFFFF"/>
               </w:rPr>
-              <w:t>Responsibility</w:t>
+              <w:t>Responsabilidade</w:t>
             </w:r>
           </w:p>
         </w:tc>
@@ -1354,7 +1354,7 @@
               <w:rPr>
                 <w:color w:val="FFFFFF"/>
               </w:rPr>
-              <w:t>Primary storage</w:t>
+              <w:t>Persistência</w:t>
             </w:r>
           </w:p>
         </w:tc>
@@ -1380,7 +1380,7 @@
               <w:rPr>
                 <w:color w:val="FFFFFF"/>
               </w:rPr>
-              <w:t>Failure behavior</w:t>
+              <w:t>Tratamento de falhas</w:t>
             </w:r>
           </w:p>
         </w:tc>
@@ -1913,13 +1913,42 @@
         <w:rPr>
           <w:rFonts w:ascii="Helvetica Neue" w:cs="Helvetica Neue" w:eastAsia="Helvetica Neue" w:hAnsi="Helvetica Neue"/>
         </w:rPr>
-        <w:keepNext/>
-      </w:pPr>
-      <w:r>
-        <w:t>5. Request Lifecycle</w:t>
+        <w:keepNext w:val="1"/>
+      </w:pPr>
+      <w:r>
+        <w:t>5 Fluxo de processamento</w:t>
       </w:r>
     </w:p>
     <w:p ns1:paraId="0000005B">
+      <w:pPr>
+        <w:keepNext w:val="1"/>
+        <w:keepLines w:val="0"/>
+        <w:pageBreakBefore w:val="0"/>
+        <w:widowControl w:val="1"/>
+        <w:numPr>
+          <w:ilvl w:val="0"/>
+          <w:numId w:val="4"/>
+        </w:numPr>
+        <w:pBdr>
+          <w:top w:space="0" w:sz="0" w:val="nil"/>
+          <w:left w:space="0" w:sz="0" w:val="nil"/>
+          <w:bottom w:space="0" w:sz="0" w:val="nil"/>
+          <w:right w:space="0" w:sz="0" w:val="nil"/>
+          <w:between w:space="0" w:sz="0" w:val="nil"/>
+        </w:pBdr>
+        <w:shd w:fill="auto" w:val="clear"/>
+        <w:spacing w:after="45" w:before="0" w:line="290" w:lineRule="auto"/>
+        <w:ind w:left="360" w:right="0" w:hanging="360"/>
+        <w:jc w:val="both"/>
+        <w:rPr>
+          <w:rFonts w:ascii="Helvetica Neue" w:cs="Helvetica Neue" w:eastAsia="Helvetica Neue" w:hAnsi="Helvetica Neue"/>
+        </w:rPr>
+      </w:pPr>
+      <w:r>
+        <w:t>O usuário envia um PDF, PNG, JPG ou WebP pela interface React. A API Starlette valida o tipo, limita tamanho e páginas, salva o arquivo e cria o registro de análise.</w:t>
+      </w:r>
+    </w:p>
+    <w:p ns1:paraId="0000005C">
       <w:pPr>
         <w:keepNext w:val="0"/>
         <w:keepLines w:val="0"/>
@@ -1945,10 +1974,10 @@
         </w:rPr>
       </w:pPr>
       <w:r>
-        <w:t>O usuário envia um PDF, PNG, JPG ou WebP pela interface React. A API Starlette valida o tipo, limita tamanho e páginas, salva o arquivo e cria o registro de análise.</w:t>
-      </w:r>
-    </w:p>
-    <w:p ns1:paraId="0000005C">
+        <w:t>A recepção valida conteúdo, tamanho, PDF criptografado e limites. A aplicação deve operar em loopback, sem autenticação ou isolamento multiusuário.</w:t>
+      </w:r>
+    </w:p>
+    <w:p ns1:paraId="0000005D">
       <w:pPr>
         <w:keepNext w:val="0"/>
         <w:keepLines w:val="0"/>
@@ -1974,10 +2003,10 @@
         </w:rPr>
       </w:pPr>
       <w:r>
-        <w:t>A recepção valida conteúdo, tamanho, PDF criptografado e limites. A aplicação deve operar em loopback, sem autenticação ou isolamento multiusuário.</w:t>
-      </w:r>
-    </w:p>
-    <w:p ns1:paraId="0000005D">
+        <w:t>O leitor documental converte páginas em texto quando possível e renderiza imagens para páginas escaneadas. O pipeline monta uma entrada multimodal com o número de cada página e seus dados visuais.</w:t>
+      </w:r>
+    </w:p>
+    <w:p ns1:paraId="0000005E">
       <w:pPr>
         <w:keepNext w:val="0"/>
         <w:keepLines w:val="0"/>
@@ -2003,10 +2032,10 @@
         </w:rPr>
       </w:pPr>
       <w:r>
-        <w:t>O leitor documental converte páginas em texto quando possível e renderiza imagens para páginas escaneadas. O pipeline monta uma entrada multimodal com o número de cada página e seus dados visuais.</w:t>
-      </w:r>
-    </w:p>
-    <w:p ns1:paraId="0000005E">
+        <w:t>Cada bloco é enviado ao Gemini 3.8 Flash. Pydantic valida a estrutura e o verificador confere as citações nas páginas originais. A consolidação preserva múltiplas evidências e valores divergentes em variants, com needs_review.</w:t>
+      </w:r>
+    </w:p>
+    <w:p ns1:paraId="0000005F">
       <w:pPr>
         <w:keepNext w:val="0"/>
         <w:keepLines w:val="0"/>
@@ -2032,10 +2061,10 @@
         </w:rPr>
       </w:pPr>
       <w:r>
-        <w:t>Cada bloco é enviado ao Gemini 3.8 Flash. Pydantic valida a estrutura e o verificador confere as citações nas páginas originais. A consolidação preserva múltiplas evidências e valores divergentes em variants, com needs_review.</w:t>
-      </w:r>
-    </w:p>
-    <w:p ns1:paraId="0000005F">
+        <w:t>O estado da análise e seus fatos são gravados no SQLite antes de a interface exibir o resultado. O arquivo original permanece em data/ para permitir auditoria e abertura da evidência.</w:t>
+      </w:r>
+    </w:p>
+    <w:p ns1:paraId="00000060">
       <w:pPr>
         <w:keepNext w:val="0"/>
         <w:keepLines w:val="0"/>
@@ -2061,10 +2090,10 @@
         </w:rPr>
       </w:pPr>
       <w:r>
-        <w:t>O estado da análise e seus fatos são gravados no SQLite antes de a interface exibir o resultado. O arquivo original permanece em data/ para permitir auditoria e abertura da evidência.</w:t>
-      </w:r>
-    </w:p>
-    <w:p ns1:paraId="00000060">
+        <w:t>Timeout de 90 segundos, até três tentativas por modelo, espera exponencial e intervalo mínimo de 15 segundos. Fallback para Gemini 3.7 em indisponibilidade, sem contornar cotas. Checkpoints atômicos permitem retomar blocos concluídos.</w:t>
+      </w:r>
+    </w:p>
+    <w:p ns1:paraId="00000061">
       <w:pPr>
         <w:keepNext w:val="0"/>
         <w:keepLines w:val="0"/>
@@ -2090,35 +2119,6 @@
         </w:rPr>
       </w:pPr>
       <w:r>
-        <w:t>Timeout de 90 segundos, até três tentativas por modelo, espera exponencial e intervalo mínimo de 15 segundos. Fallback para Gemini 3.7 em indisponibilidade, sem contornar cotas. Checkpoints atômicos permitem retomar blocos concluídos.</w:t>
-      </w:r>
-    </w:p>
-    <w:p ns1:paraId="00000061">
-      <w:pPr>
-        <w:keepNext w:val="0"/>
-        <w:keepLines w:val="0"/>
-        <w:pageBreakBefore w:val="0"/>
-        <w:widowControl w:val="1"/>
-        <w:numPr>
-          <w:ilvl w:val="0"/>
-          <w:numId w:val="4"/>
-        </w:numPr>
-        <w:pBdr>
-          <w:top w:space="0" w:sz="0" w:val="nil"/>
-          <w:left w:space="0" w:sz="0" w:val="nil"/>
-          <w:bottom w:space="0" w:sz="0" w:val="nil"/>
-          <w:right w:space="0" w:sz="0" w:val="nil"/>
-          <w:between w:space="0" w:sz="0" w:val="nil"/>
-        </w:pBdr>
-        <w:shd w:fill="auto" w:val="clear"/>
-        <w:spacing w:after="45" w:before="0" w:line="290" w:lineRule="auto"/>
-        <w:ind w:left="360" w:right="0" w:hanging="360"/>
-        <w:jc w:val="both"/>
-        <w:rPr>
-          <w:rFonts w:ascii="Helvetica Neue" w:cs="Helvetica Neue" w:eastAsia="Helvetica Neue" w:hAnsi="Helvetica Neue"/>
-        </w:rPr>
-      </w:pPr>
-      <w:r>
         <w:t>Ao concluir, a API retorna fatos, alertas e páginas de evidência. A interface permite consulta contextual, comparação, abertura do trecho de origem e exportação em PDF ou JSON.</w:t>
       </w:r>
     </w:p>
@@ -2145,7 +2145,7 @@
         </w:rPr>
       </w:pPr>
       <w:r>
-        <w:t>6. API and Data Contracts</w:t>
+        <w:t>6 Contratos de dados</w:t>
       </w:r>
     </w:p>
     <w:p ns1:paraId="00000064">
@@ -2155,7 +2155,7 @@
         <w:rPr/>
       </w:pPr>
       <w:r>
-        <w:t>Primary data contract</w:t>
+        <w:t>Registro público da análise</w:t>
       </w:r>
     </w:p>
     <w:p ns1:paraId="00000065">
@@ -2230,7 +2230,7 @@
               <w:rPr>
                 <w:color w:val="FFFFFF"/>
               </w:rPr>
-              <w:t>Field</w:t>
+              <w:t>Campo</w:t>
             </w:r>
           </w:p>
         </w:tc>
@@ -2256,7 +2256,7 @@
               <w:rPr>
                 <w:color w:val="FFFFFF"/>
               </w:rPr>
-              <w:t>Type</w:t>
+              <w:t>Tipo</w:t>
             </w:r>
           </w:p>
         </w:tc>
@@ -2282,7 +2282,7 @@
               <w:rPr>
                 <w:color w:val="FFFFFF"/>
               </w:rPr>
-              <w:t>Required</w:t>
+              <w:t>Obrigatório</w:t>
             </w:r>
           </w:p>
         </w:tc>
@@ -2308,7 +2308,7 @@
               <w:rPr>
                 <w:color w:val="FFFFFF"/>
               </w:rPr>
-              <w:t>Description</w:t>
+              <w:t>Descrição</w:t>
             </w:r>
           </w:p>
         </w:tc>
@@ -2337,7 +2337,7 @@
           </w:tcPr>
           <w:p>
             <w:r>
-              <w:t>policy_id</w:t>
+              <w:t>id</w:t>
             </w:r>
           </w:p>
         </w:tc>
@@ -2381,7 +2381,7 @@
           </w:tcPr>
           <w:p>
             <w:r>
-              <w:t>Yes</w:t>
+              <w:t>Sim</w:t>
             </w:r>
           </w:p>
         </w:tc>
@@ -2432,7 +2432,7 @@
           </w:tcPr>
           <w:p>
             <w:r>
-              <w:t>document_type</w:t>
+              <w:t>status</w:t>
             </w:r>
           </w:p>
         </w:tc>
@@ -2478,7 +2478,7 @@
           </w:tcPr>
           <w:p>
             <w:r>
-              <w:t>Yes</w:t>
+              <w:t>Sim</w:t>
             </w:r>
           </w:p>
         </w:tc>
@@ -2501,7 +2501,7 @@
           </w:tcPr>
           <w:p>
             <w:r>
-              <w:t>do_policy, uncertain ou other.</w:t>
+              <w:t>queued, reading, extracting, ready ou error.</w:t>
             </w:r>
           </w:p>
         </w:tc>
@@ -2576,7 +2576,7 @@
           </w:tcPr>
           <w:p>
             <w:r>
-              <w:t>Yes</w:t>
+              <w:t>Sim</w:t>
             </w:r>
           </w:p>
         </w:tc>
@@ -2674,7 +2674,7 @@
           </w:tcPr>
           <w:p>
             <w:r>
-              <w:t>No</w:t>
+              <w:t>Não</w:t>
             </w:r>
           </w:p>
         </w:tc>
@@ -2772,7 +2772,7 @@
           </w:tcPr>
           <w:p>
             <w:r>
-              <w:t>No</w:t>
+              <w:t>Não</w:t>
             </w:r>
           </w:p>
         </w:tc>
@@ -2870,7 +2870,7 @@
           </w:tcPr>
           <w:p>
             <w:r>
-              <w:t>No</w:t>
+              <w:t>Não</w:t>
             </w:r>
           </w:p>
         </w:tc>
@@ -2968,7 +2968,7 @@
           </w:tcPr>
           <w:p>
             <w:r>
-              <w:t>Yes</w:t>
+              <w:t>Sim</w:t>
             </w:r>
           </w:p>
         </w:tc>
@@ -3017,10 +3017,10 @@
         <w:pStyle w:val="Heading3"/>
         <w:spacing w:after="90" w:line="280" w:lineRule="auto"/>
         <w:rPr/>
-        <w:keepNext/>
-      </w:pPr>
-      <w:r>
-        <w:t>Contract guarantees</w:t>
+        <w:keepNext w:val="1"/>
+      </w:pPr>
+      <w:r>
+        <w:t>Garantias do contrato</w:t>
       </w:r>
     </w:p>
     <w:p ns1:paraId="00000088">
@@ -3031,7 +3031,7 @@
           <w:sz w:val="16"/>
           <w:szCs w:val="16"/>
         </w:rPr>
-        <w:keepNext/>
+        <w:keepNext w:val="1"/>
       </w:pPr>
       <w:r>
         <w:rPr>
@@ -3040,6 +3040,93 @@
       </w:r>
     </w:p>
     <w:p ns1:paraId="00000089">
+      <w:pPr>
+        <w:keepNext w:val="1"/>
+        <w:keepLines w:val="0"/>
+        <w:pageBreakBefore w:val="0"/>
+        <w:widowControl w:val="1"/>
+        <w:numPr>
+          <w:ilvl w:val="0"/>
+          <w:numId w:val="1"/>
+        </w:numPr>
+        <w:pBdr>
+          <w:top w:space="0" w:sz="0" w:val="nil"/>
+          <w:left w:space="0" w:sz="0" w:val="nil"/>
+          <w:bottom w:space="0" w:sz="0" w:val="nil"/>
+          <w:right w:space="0" w:sz="0" w:val="nil"/>
+          <w:between w:space="0" w:sz="0" w:val="nil"/>
+        </w:pBdr>
+        <w:shd w:fill="auto" w:val="clear"/>
+        <w:spacing w:after="45" w:before="0" w:line="290" w:lineRule="auto"/>
+        <w:ind w:left="720" w:right="0" w:hanging="360"/>
+        <w:jc w:val="both"/>
+        <w:rPr>
+          <w:rFonts w:ascii="Helvetica Neue" w:cs="Helvetica Neue" w:eastAsia="Helvetica Neue" w:hAnsi="Helvetica Neue"/>
+        </w:rPr>
+      </w:pPr>
+      <w:r>
+        <w:t>Nenhum fato com valor é exibido como verificado sem quote, page e correspondência local na página. Evidências exclusivamente visuais recebem visual_review e exigem conferência humana.</w:t>
+      </w:r>
+    </w:p>
+    <w:p ns1:paraId="0000008A">
+      <w:pPr>
+        <w:keepNext w:val="1"/>
+        <w:keepLines w:val="0"/>
+        <w:pageBreakBefore w:val="0"/>
+        <w:widowControl w:val="1"/>
+        <w:numPr>
+          <w:ilvl w:val="0"/>
+          <w:numId w:val="1"/>
+        </w:numPr>
+        <w:pBdr>
+          <w:top w:space="0" w:sz="0" w:val="nil"/>
+          <w:left w:space="0" w:sz="0" w:val="nil"/>
+          <w:bottom w:space="0" w:sz="0" w:val="nil"/>
+          <w:right w:space="0" w:sz="0" w:val="nil"/>
+          <w:between w:space="0" w:sz="0" w:val="nil"/>
+        </w:pBdr>
+        <w:shd w:fill="auto" w:val="clear"/>
+        <w:spacing w:after="45" w:before="0" w:line="290" w:lineRule="auto"/>
+        <w:ind w:left="720" w:right="0" w:hanging="360"/>
+        <w:jc w:val="both"/>
+        <w:rPr>
+          <w:rFonts w:ascii="Helvetica Neue" w:cs="Helvetica Neue" w:eastAsia="Helvetica Neue" w:hAnsi="Helvetica Neue"/>
+        </w:rPr>
+      </w:pPr>
+      <w:r>
+        <w:t>Estados: queued, reading, extracting, ready e error. Comparações preservam uma fotografia dos fatos e usam um catálogo estável de 16 campos.</w:t>
+      </w:r>
+    </w:p>
+    <w:p ns1:paraId="0000008B">
+      <w:pPr>
+        <w:keepNext w:val="1"/>
+        <w:keepLines w:val="0"/>
+        <w:pageBreakBefore w:val="0"/>
+        <w:widowControl w:val="1"/>
+        <w:numPr>
+          <w:ilvl w:val="0"/>
+          <w:numId w:val="1"/>
+        </w:numPr>
+        <w:pBdr>
+          <w:top w:space="0" w:sz="0" w:val="nil"/>
+          <w:left w:space="0" w:sz="0" w:val="nil"/>
+          <w:bottom w:space="0" w:sz="0" w:val="nil"/>
+          <w:right w:space="0" w:sz="0" w:val="nil"/>
+          <w:between w:space="0" w:sz="0" w:val="nil"/>
+        </w:pBdr>
+        <w:shd w:fill="auto" w:val="clear"/>
+        <w:spacing w:after="45" w:before="0" w:line="290" w:lineRule="auto"/>
+        <w:ind w:left="720" w:right="0" w:hanging="360"/>
+        <w:jc w:val="both"/>
+        <w:rPr>
+          <w:rFonts w:ascii="Helvetica Neue" w:cs="Helvetica Neue" w:eastAsia="Helvetica Neue" w:hAnsi="Helvetica Neue"/>
+        </w:rPr>
+      </w:pPr>
+      <w:r>
+        <w:t>O registro guarda modelo configurado, models_used, progresso completed_chunks/total_chunks/cached_chunks, páginas, fatos, variants, needs_review e avisos.</w:t>
+      </w:r>
+    </w:p>
+    <w:p ns1:paraId="0000008C">
       <w:pPr>
         <w:keepNext w:val="0"/>
         <w:keepLines w:val="0"/>
@@ -3065,93 +3152,6 @@
         </w:rPr>
       </w:pPr>
       <w:r>
-        <w:t>Nenhum fato com valor é exibido como verificado sem quote, page e correspondência local na página. Evidências exclusivamente visuais recebem visual_review e exigem conferência humana.</w:t>
-      </w:r>
-    </w:p>
-    <w:p ns1:paraId="0000008A">
-      <w:pPr>
-        <w:keepNext w:val="0"/>
-        <w:keepLines w:val="0"/>
-        <w:pageBreakBefore w:val="0"/>
-        <w:widowControl w:val="1"/>
-        <w:numPr>
-          <w:ilvl w:val="0"/>
-          <w:numId w:val="1"/>
-        </w:numPr>
-        <w:pBdr>
-          <w:top w:space="0" w:sz="0" w:val="nil"/>
-          <w:left w:space="0" w:sz="0" w:val="nil"/>
-          <w:bottom w:space="0" w:sz="0" w:val="nil"/>
-          <w:right w:space="0" w:sz="0" w:val="nil"/>
-          <w:between w:space="0" w:sz="0" w:val="nil"/>
-        </w:pBdr>
-        <w:shd w:fill="auto" w:val="clear"/>
-        <w:spacing w:after="45" w:before="0" w:line="290" w:lineRule="auto"/>
-        <w:ind w:left="720" w:right="0" w:hanging="360"/>
-        <w:jc w:val="both"/>
-        <w:rPr>
-          <w:rFonts w:ascii="Helvetica Neue" w:cs="Helvetica Neue" w:eastAsia="Helvetica Neue" w:hAnsi="Helvetica Neue"/>
-        </w:rPr>
-      </w:pPr>
-      <w:r>
-        <w:t>Estados: queued, reading, extracting, ready e error. Comparações preservam uma fotografia dos fatos e usam um catálogo estável de 16 campos.</w:t>
-      </w:r>
-    </w:p>
-    <w:p ns1:paraId="0000008B">
-      <w:pPr>
-        <w:keepNext w:val="0"/>
-        <w:keepLines w:val="0"/>
-        <w:pageBreakBefore w:val="0"/>
-        <w:widowControl w:val="1"/>
-        <w:numPr>
-          <w:ilvl w:val="0"/>
-          <w:numId w:val="1"/>
-        </w:numPr>
-        <w:pBdr>
-          <w:top w:space="0" w:sz="0" w:val="nil"/>
-          <w:left w:space="0" w:sz="0" w:val="nil"/>
-          <w:bottom w:space="0" w:sz="0" w:val="nil"/>
-          <w:right w:space="0" w:sz="0" w:val="nil"/>
-          <w:between w:space="0" w:sz="0" w:val="nil"/>
-        </w:pBdr>
-        <w:shd w:fill="auto" w:val="clear"/>
-        <w:spacing w:after="45" w:before="0" w:line="290" w:lineRule="auto"/>
-        <w:ind w:left="720" w:right="0" w:hanging="360"/>
-        <w:jc w:val="both"/>
-        <w:rPr>
-          <w:rFonts w:ascii="Helvetica Neue" w:cs="Helvetica Neue" w:eastAsia="Helvetica Neue" w:hAnsi="Helvetica Neue"/>
-        </w:rPr>
-      </w:pPr>
-      <w:r>
-        <w:t>O registro guarda modelo configurado, models_used, progresso completed_chunks/total_chunks/cached_chunks, páginas, fatos, variants, needs_review e avisos.</w:t>
-      </w:r>
-    </w:p>
-    <w:p ns1:paraId="0000008C">
-      <w:pPr>
-        <w:keepNext w:val="0"/>
-        <w:keepLines w:val="0"/>
-        <w:pageBreakBefore w:val="0"/>
-        <w:widowControl w:val="1"/>
-        <w:numPr>
-          <w:ilvl w:val="0"/>
-          <w:numId w:val="1"/>
-        </w:numPr>
-        <w:pBdr>
-          <w:top w:space="0" w:sz="0" w:val="nil"/>
-          <w:left w:space="0" w:sz="0" w:val="nil"/>
-          <w:bottom w:space="0" w:sz="0" w:val="nil"/>
-          <w:right w:space="0" w:sz="0" w:val="nil"/>
-          <w:between w:space="0" w:sz="0" w:val="nil"/>
-        </w:pBdr>
-        <w:shd w:fill="auto" w:val="clear"/>
-        <w:spacing w:after="45" w:before="0" w:line="290" w:lineRule="auto"/>
-        <w:ind w:left="720" w:right="0" w:hanging="360"/>
-        <w:jc w:val="both"/>
-        <w:rPr>
-          <w:rFonts w:ascii="Helvetica Neue" w:cs="Helvetica Neue" w:eastAsia="Helvetica Neue" w:hAnsi="Helvetica Neue"/>
-        </w:rPr>
-      </w:pPr>
-      <w:r>
         <w:t>O JSON estruturado é a fonte da aplicação para a demonstração, não uma interpretação jurídica definitiva nem prova de cobertura contratada.</w:t>
       </w:r>
     </w:p>
@@ -3200,7 +3200,7 @@
         </w:rPr>
       </w:pPr>
       <w:r>
-        <w:t>7. Consistency, Idempotency, and Replay</w:t>
+        <w:t>7 Consistência e retomada</w:t>
       </w:r>
     </w:p>
     <w:p ns1:paraId="00000091">
@@ -3283,7 +3283,7 @@
               <w:rPr>
                 <w:color w:val="FFFFFF"/>
               </w:rPr>
-              <w:t>Scenario</w:t>
+              <w:t>Situação</w:t>
             </w:r>
           </w:p>
         </w:tc>
@@ -3309,7 +3309,7 @@
               <w:rPr>
                 <w:color w:val="FFFFFF"/>
               </w:rPr>
-              <w:t>Expected behavior</w:t>
+              <w:t>Comportamento</w:t>
             </w:r>
           </w:p>
         </w:tc>
@@ -3335,7 +3335,7 @@
               <w:rPr>
                 <w:color w:val="FFFFFF"/>
               </w:rPr>
-              <w:t>Reasoning</w:t>
+              <w:t>Finalidade</w:t>
             </w:r>
           </w:p>
         </w:tc>
@@ -3662,9 +3662,10 @@
         <w:rPr>
           <w:rFonts w:ascii="Helvetica Neue" w:cs="Helvetica Neue" w:eastAsia="Helvetica Neue" w:hAnsi="Helvetica Neue"/>
         </w:rPr>
-      </w:pPr>
-      <w:r>
-        <w:t>8. Security and Privacy Considerations</w:t>
+        <w:keepNext w:val="1"/>
+      </w:pPr>
+      <w:r>
+        <w:t>8 Dados e configuração</w:t>
       </w:r>
     </w:p>
     <w:p ns1:paraId="000000A4">
@@ -3673,6 +3674,7 @@
         <w:rPr>
           <w:rFonts w:ascii="Helvetica Neue" w:cs="Helvetica Neue" w:eastAsia="Helvetica Neue" w:hAnsi="Helvetica Neue"/>
         </w:rPr>
+        <w:keepNext w:val="1"/>
       </w:pPr>
       <w:r>
         <w:rPr>
@@ -3681,6 +3683,122 @@
       </w:r>
     </w:p>
     <w:p ns1:paraId="000000A5">
+      <w:pPr>
+        <w:keepNext w:val="1"/>
+        <w:keepLines w:val="0"/>
+        <w:pageBreakBefore w:val="0"/>
+        <w:widowControl w:val="1"/>
+        <w:numPr>
+          <w:ilvl w:val="0"/>
+          <w:numId w:val="2"/>
+        </w:numPr>
+        <w:pBdr>
+          <w:top w:space="0" w:sz="0" w:val="nil"/>
+          <w:left w:space="0" w:sz="0" w:val="nil"/>
+          <w:bottom w:space="0" w:sz="0" w:val="nil"/>
+          <w:right w:space="0" w:sz="0" w:val="nil"/>
+          <w:between w:space="0" w:sz="0" w:val="nil"/>
+        </w:pBdr>
+        <w:shd w:fill="auto" w:val="clear"/>
+        <w:spacing w:after="45" w:before="0" w:line="290" w:lineRule="auto"/>
+        <w:ind w:left="360" w:right="0" w:hanging="360"/>
+        <w:jc w:val="both"/>
+        <w:rPr>
+          <w:rFonts w:ascii="Helvetica Neue" w:cs="Helvetica Neue" w:eastAsia="Helvetica Neue" w:hAnsi="Helvetica Neue"/>
+        </w:rPr>
+      </w:pPr>
+      <w:r>
+        <w:t>A versão acadêmica não implementa autenticação, autorização ou tenancy. Uma implantação pública deve adicionar identidade e segregação por usuário.</w:t>
+      </w:r>
+    </w:p>
+    <w:p ns1:paraId="000000A6">
+      <w:pPr>
+        <w:keepNext w:val="1"/>
+        <w:keepLines w:val="0"/>
+        <w:pageBreakBefore w:val="0"/>
+        <w:widowControl w:val="1"/>
+        <w:numPr>
+          <w:ilvl w:val="0"/>
+          <w:numId w:val="2"/>
+        </w:numPr>
+        <w:pBdr>
+          <w:top w:space="0" w:sz="0" w:val="nil"/>
+          <w:left w:space="0" w:sz="0" w:val="nil"/>
+          <w:bottom w:space="0" w:sz="0" w:val="nil"/>
+          <w:right w:space="0" w:sz="0" w:val="nil"/>
+          <w:between w:space="0" w:sz="0" w:val="nil"/>
+        </w:pBdr>
+        <w:shd w:fill="auto" w:val="clear"/>
+        <w:spacing w:after="45" w:before="0" w:line="290" w:lineRule="auto"/>
+        <w:ind w:left="360" w:right="0" w:hanging="360"/>
+        <w:jc w:val="both"/>
+        <w:rPr>
+          <w:rFonts w:ascii="Helvetica Neue" w:cs="Helvetica Neue" w:eastAsia="Helvetica Neue" w:hAnsi="Helvetica Neue"/>
+        </w:rPr>
+      </w:pPr>
+      <w:r>
+        <w:t>Documentos podem conter dados pessoais e informações corporativas sensíveis. O MVP evita registrar conteúdo integral em logs e mantém arquivos no diretório data/.</w:t>
+      </w:r>
+    </w:p>
+    <w:p ns1:paraId="000000A7">
+      <w:pPr>
+        <w:keepNext w:val="1"/>
+        <w:keepLines w:val="0"/>
+        <w:pageBreakBefore w:val="0"/>
+        <w:widowControl w:val="1"/>
+        <w:numPr>
+          <w:ilvl w:val="0"/>
+          <w:numId w:val="2"/>
+        </w:numPr>
+        <w:pBdr>
+          <w:top w:space="0" w:sz="0" w:val="nil"/>
+          <w:left w:space="0" w:sz="0" w:val="nil"/>
+          <w:bottom w:space="0" w:sz="0" w:val="nil"/>
+          <w:right w:space="0" w:sz="0" w:val="nil"/>
+          <w:between w:space="0" w:sz="0" w:val="nil"/>
+        </w:pBdr>
+        <w:shd w:fill="auto" w:val="clear"/>
+        <w:spacing w:after="45" w:before="0" w:line="290" w:lineRule="auto"/>
+        <w:ind w:left="360" w:right="0" w:hanging="360"/>
+        <w:jc w:val="both"/>
+        <w:rPr>
+          <w:rFonts w:ascii="Helvetica Neue" w:cs="Helvetica Neue" w:eastAsia="Helvetica Neue" w:hAnsi="Helvetica Neue"/>
+        </w:rPr>
+      </w:pPr>
+      <w:r>
+        <w:t>GEMINI_API_KEY permanece no servidor. GEMINI_MODEL define o modelo principal e GEMINI_FALLBACK_MODELS define as alternativas. O ZIP e o Git excluem .env, data e documentos privados.</w:t>
+      </w:r>
+    </w:p>
+    <w:p ns1:paraId="000000A8">
+      <w:pPr>
+        <w:keepNext w:val="1"/>
+        <w:keepLines w:val="0"/>
+        <w:pageBreakBefore w:val="0"/>
+        <w:widowControl w:val="1"/>
+        <w:numPr>
+          <w:ilvl w:val="0"/>
+          <w:numId w:val="2"/>
+        </w:numPr>
+        <w:pBdr>
+          <w:top w:space="0" w:sz="0" w:val="nil"/>
+          <w:left w:space="0" w:sz="0" w:val="nil"/>
+          <w:bottom w:space="0" w:sz="0" w:val="nil"/>
+          <w:right w:space="0" w:sz="0" w:val="nil"/>
+          <w:between w:space="0" w:sz="0" w:val="nil"/>
+        </w:pBdr>
+        <w:shd w:fill="auto" w:val="clear"/>
+        <w:spacing w:after="45" w:before="0" w:line="290" w:lineRule="auto"/>
+        <w:ind w:left="360" w:right="0" w:hanging="360"/>
+        <w:jc w:val="both"/>
+        <w:rPr>
+          <w:rFonts w:ascii="Helvetica Neue" w:cs="Helvetica Neue" w:eastAsia="Helvetica Neue" w:hAnsi="Helvetica Neue"/>
+        </w:rPr>
+      </w:pPr>
+      <w:r>
+        <w:t>Endpoints de reprocessamento, exportação e carga de exemplos devem permanecer protegidos em qualquer exposição pública. Limites de páginas, caracteres e MIME são defaults de segurança e custo.</w:t>
+      </w:r>
+    </w:p>
+    <w:p ns1:paraId="000000A9">
       <w:pPr>
         <w:keepNext w:val="0"/>
         <w:keepLines w:val="0"/>
@@ -3706,122 +3824,6 @@
         </w:rPr>
       </w:pPr>
       <w:r>
-        <w:t>A versão acadêmica não implementa autenticação, autorização ou tenancy. Uma implantação pública deve adicionar identidade e segregação por usuário.</w:t>
-      </w:r>
-    </w:p>
-    <w:p ns1:paraId="000000A6">
-      <w:pPr>
-        <w:keepNext w:val="0"/>
-        <w:keepLines w:val="0"/>
-        <w:pageBreakBefore w:val="0"/>
-        <w:widowControl w:val="1"/>
-        <w:numPr>
-          <w:ilvl w:val="0"/>
-          <w:numId w:val="2"/>
-        </w:numPr>
-        <w:pBdr>
-          <w:top w:space="0" w:sz="0" w:val="nil"/>
-          <w:left w:space="0" w:sz="0" w:val="nil"/>
-          <w:bottom w:space="0" w:sz="0" w:val="nil"/>
-          <w:right w:space="0" w:sz="0" w:val="nil"/>
-          <w:between w:space="0" w:sz="0" w:val="nil"/>
-        </w:pBdr>
-        <w:shd w:fill="auto" w:val="clear"/>
-        <w:spacing w:after="45" w:before="0" w:line="290" w:lineRule="auto"/>
-        <w:ind w:left="360" w:right="0" w:hanging="360"/>
-        <w:jc w:val="both"/>
-        <w:rPr>
-          <w:rFonts w:ascii="Helvetica Neue" w:cs="Helvetica Neue" w:eastAsia="Helvetica Neue" w:hAnsi="Helvetica Neue"/>
-        </w:rPr>
-      </w:pPr>
-      <w:r>
-        <w:t>Documentos podem conter dados pessoais e informações corporativas sensíveis. O MVP evita registrar conteúdo integral em logs e mantém arquivos no diretório data/.</w:t>
-      </w:r>
-    </w:p>
-    <w:p ns1:paraId="000000A7">
-      <w:pPr>
-        <w:keepNext w:val="0"/>
-        <w:keepLines w:val="0"/>
-        <w:pageBreakBefore w:val="0"/>
-        <w:widowControl w:val="1"/>
-        <w:numPr>
-          <w:ilvl w:val="0"/>
-          <w:numId w:val="2"/>
-        </w:numPr>
-        <w:pBdr>
-          <w:top w:space="0" w:sz="0" w:val="nil"/>
-          <w:left w:space="0" w:sz="0" w:val="nil"/>
-          <w:bottom w:space="0" w:sz="0" w:val="nil"/>
-          <w:right w:space="0" w:sz="0" w:val="nil"/>
-          <w:between w:space="0" w:sz="0" w:val="nil"/>
-        </w:pBdr>
-        <w:shd w:fill="auto" w:val="clear"/>
-        <w:spacing w:after="45" w:before="0" w:line="290" w:lineRule="auto"/>
-        <w:ind w:left="360" w:right="0" w:hanging="360"/>
-        <w:jc w:val="both"/>
-        <w:rPr>
-          <w:rFonts w:ascii="Helvetica Neue" w:cs="Helvetica Neue" w:eastAsia="Helvetica Neue" w:hAnsi="Helvetica Neue"/>
-        </w:rPr>
-      </w:pPr>
-      <w:r>
-        <w:t>GEMINI_API_KEY permanece no servidor. GEMINI_MODEL define o modelo principal e GEMINI_FALLBACK_MODELS define as alternativas. O ZIP e o Git excluem .env, data e documentos privados.</w:t>
-      </w:r>
-    </w:p>
-    <w:p ns1:paraId="000000A8">
-      <w:pPr>
-        <w:keepNext w:val="0"/>
-        <w:keepLines w:val="0"/>
-        <w:pageBreakBefore w:val="0"/>
-        <w:widowControl w:val="1"/>
-        <w:numPr>
-          <w:ilvl w:val="0"/>
-          <w:numId w:val="2"/>
-        </w:numPr>
-        <w:pBdr>
-          <w:top w:space="0" w:sz="0" w:val="nil"/>
-          <w:left w:space="0" w:sz="0" w:val="nil"/>
-          <w:bottom w:space="0" w:sz="0" w:val="nil"/>
-          <w:right w:space="0" w:sz="0" w:val="nil"/>
-          <w:between w:space="0" w:sz="0" w:val="nil"/>
-        </w:pBdr>
-        <w:shd w:fill="auto" w:val="clear"/>
-        <w:spacing w:after="45" w:before="0" w:line="290" w:lineRule="auto"/>
-        <w:ind w:left="360" w:right="0" w:hanging="360"/>
-        <w:jc w:val="both"/>
-        <w:rPr>
-          <w:rFonts w:ascii="Helvetica Neue" w:cs="Helvetica Neue" w:eastAsia="Helvetica Neue" w:hAnsi="Helvetica Neue"/>
-        </w:rPr>
-      </w:pPr>
-      <w:r>
-        <w:t>Endpoints de reprocessamento, exportação e carga de exemplos devem permanecer protegidos em qualquer exposição pública. Limites de páginas, caracteres e MIME são defaults de segurança e custo.</w:t>
-      </w:r>
-    </w:p>
-    <w:p ns1:paraId="000000A9">
-      <w:pPr>
-        <w:keepNext w:val="0"/>
-        <w:keepLines w:val="0"/>
-        <w:pageBreakBefore w:val="0"/>
-        <w:widowControl w:val="1"/>
-        <w:numPr>
-          <w:ilvl w:val="0"/>
-          <w:numId w:val="2"/>
-        </w:numPr>
-        <w:pBdr>
-          <w:top w:space="0" w:sz="0" w:val="nil"/>
-          <w:left w:space="0" w:sz="0" w:val="nil"/>
-          <w:bottom w:space="0" w:sz="0" w:val="nil"/>
-          <w:right w:space="0" w:sz="0" w:val="nil"/>
-          <w:between w:space="0" w:sz="0" w:val="nil"/>
-        </w:pBdr>
-        <w:shd w:fill="auto" w:val="clear"/>
-        <w:spacing w:after="45" w:before="0" w:line="290" w:lineRule="auto"/>
-        <w:ind w:left="360" w:right="0" w:hanging="360"/>
-        <w:jc w:val="both"/>
-        <w:rPr>
-          <w:rFonts w:ascii="Helvetica Neue" w:cs="Helvetica Neue" w:eastAsia="Helvetica Neue" w:hAnsi="Helvetica Neue"/>
-        </w:rPr>
-      </w:pPr>
-      <w:r>
         <w:t>A retenção atual é local e indefinida até exclusão manual. Uma evolução deve definir prazo, exclusão segura, criptografia, residência e auditoria.</w:t>
       </w:r>
     </w:p>
@@ -3907,7 +3909,7 @@
         </w:rPr>
       </w:pPr>
       <w:r>
-        <w:t>9. Operational Readiness</w:t>
+        <w:t>9 Operação local</w:t>
       </w:r>
     </w:p>
     <w:tbl>
@@ -3967,7 +3969,7 @@
               <w:rPr>
                 <w:color w:val="FFFFFF"/>
               </w:rPr>
-              <w:t>Signal</w:t>
+              <w:t>Sinal</w:t>
             </w:r>
           </w:p>
         </w:tc>
@@ -3993,7 +3995,7 @@
               <w:rPr>
                 <w:color w:val="FFFFFF"/>
               </w:rPr>
-              <w:t>SLO or alert</w:t>
+              <w:t>Verificação</w:t>
             </w:r>
           </w:p>
         </w:tc>
@@ -4019,7 +4021,7 @@
               <w:rPr>
                 <w:color w:val="FFFFFF"/>
               </w:rPr>
-              <w:t>Owner</w:t>
+              <w:t>Responsável</w:t>
             </w:r>
           </w:p>
         </w:tc>
@@ -4045,7 +4047,7 @@
               <w:rPr>
                 <w:color w:val="FFFFFF"/>
               </w:rPr>
-              <w:t>Launch gate</w:t>
+              <w:t>Cobertura</w:t>
             </w:r>
           </w:p>
         </w:tc>
@@ -4097,7 +4099,7 @@
           </w:tcPr>
           <w:p>
             <w:r>
-              <w:t>Acompanhar taxa de sucesso.</w:t>
+              <w:t>Estado de cada análise na biblioteca.</w:t>
             </w:r>
           </w:p>
         </w:tc>
@@ -4143,7 +4145,7 @@
           </w:tcPr>
           <w:p>
             <w:r>
-              <w:t>Required</w:t>
+              <w:t>Interface</w:t>
             </w:r>
           </w:p>
         </w:tc>
@@ -4195,7 +4197,7 @@
           </w:tcPr>
           <w:p>
             <w:r>
-              <w:t>Medir p95 por documento.</w:t>
+              <w:t>Progresso dos blocos na análise.</w:t>
             </w:r>
           </w:p>
         </w:tc>
@@ -4241,7 +4243,7 @@
           </w:tcPr>
           <w:p>
             <w:r>
-              <w:t>Recommended</w:t>
+              <w:t>Interface</w:t>
             </w:r>
           </w:p>
         </w:tc>
@@ -4293,7 +4295,7 @@
           </w:tcPr>
           <w:p>
             <w:r>
-              <w:t>Alertar erros do provedor.</w:t>
+              <w:t>Erro acionável e nova tentativa.</w:t>
             </w:r>
           </w:p>
         </w:tc>
@@ -4339,7 +4341,7 @@
           </w:tcPr>
           <w:p>
             <w:r>
-              <w:t>Required</w:t>
+              <w:t>API e interface</w:t>
             </w:r>
           </w:p>
         </w:tc>
@@ -4391,7 +4393,7 @@
           </w:tcPr>
           <w:p>
             <w:r>
-              <w:t>Verificar ausência de chave em commits.</w:t>
+              <w:t>Chave apenas no ambiente do servidor.</w:t>
             </w:r>
           </w:p>
         </w:tc>
@@ -4437,7 +4439,7 @@
           </w:tcPr>
           <w:p>
             <w:r>
-              <w:t>Required</w:t>
+              <w:t>Configuração</w:t>
             </w:r>
           </w:p>
         </w:tc>
@@ -4489,7 +4491,7 @@
           </w:tcPr>
           <w:p>
             <w:r>
-              <w:t>Executar suíte a cada alteração.</w:t>
+              <w:t>Suíte e registro dos PDFs de demonstração.</w:t>
             </w:r>
           </w:p>
         </w:tc>
@@ -4535,7 +4537,7 @@
           </w:tcPr>
           <w:p>
             <w:r>
-              <w:t>Required</w:t>
+              <w:t>Testes</w:t>
             </w:r>
           </w:p>
         </w:tc>
@@ -4590,9 +4592,10 @@
         <w:rPr>
           <w:rFonts w:ascii="Helvetica Neue" w:cs="Helvetica Neue" w:eastAsia="Helvetica Neue" w:hAnsi="Helvetica Neue"/>
         </w:rPr>
-      </w:pPr>
-      <w:r>
-        <w:t>10. Alternatives Considered</w:t>
+        <w:keepNext w:val="1"/>
+      </w:pPr>
+      <w:r>
+        <w:t>10 Decisões de implementação</w:t>
       </w:r>
     </w:p>
     <w:p ns1:paraId="000000CB">
@@ -4601,6 +4604,7 @@
         <w:rPr>
           <w:rFonts w:ascii="Helvetica Neue" w:cs="Helvetica Neue" w:eastAsia="Helvetica Neue" w:hAnsi="Helvetica Neue"/>
         </w:rPr>
+        <w:keepNext w:val="1"/>
       </w:pPr>
       <w:r>
         <w:rPr>
@@ -4614,6 +4618,7 @@
         <w:rPr>
           <w:rFonts w:ascii="Helvetica Neue" w:cs="Helvetica Neue" w:eastAsia="Helvetica Neue" w:hAnsi="Helvetica Neue"/>
         </w:rPr>
+        <w:keepNext w:val="1"/>
       </w:pPr>
       <w:r>
         <w:rPr>
@@ -4676,7 +4681,7 @@
               <w:rPr>
                 <w:color w:val="FFFFFF"/>
               </w:rPr>
-              <w:t>Alternative</w:t>
+              <w:t>Alternativa</w:t>
             </w:r>
           </w:p>
         </w:tc>
@@ -4702,7 +4707,7 @@
               <w:rPr>
                 <w:color w:val="FFFFFF"/>
               </w:rPr>
-              <w:t>Why it was considered</w:t>
+              <w:t>Finalidade</w:t>
             </w:r>
           </w:p>
         </w:tc>
@@ -4728,7 +4733,7 @@
               <w:rPr>
                 <w:color w:val="FFFFFF"/>
               </w:rPr>
-              <w:t>Why it was not selected</w:t>
+              <w:t>Decisão no MVP</w:t>
             </w:r>
           </w:p>
         </w:tc>
@@ -5055,12 +5060,100 @@
         <w:rPr>
           <w:rFonts w:ascii="Helvetica Neue" w:cs="Helvetica Neue" w:eastAsia="Helvetica Neue" w:hAnsi="Helvetica Neue"/>
         </w:rPr>
-      </w:pPr>
-      <w:r>
-        <w:t>11. Open Questions</w:t>
+        <w:keepNext w:val="1"/>
+      </w:pPr>
+      <w:r>
+        <w:t>11 Limites da interpretação</w:t>
       </w:r>
     </w:p>
     <w:p ns1:paraId="000000DE">
+      <w:pPr>
+        <w:keepNext w:val="1"/>
+        <w:keepLines w:val="0"/>
+        <w:pageBreakBefore w:val="0"/>
+        <w:widowControl w:val="1"/>
+        <w:numPr>
+          <w:ilvl w:val="0"/>
+          <w:numId w:val="3"/>
+        </w:numPr>
+        <w:pBdr>
+          <w:top w:space="0" w:sz="0" w:val="nil"/>
+          <w:left w:space="0" w:sz="0" w:val="nil"/>
+          <w:bottom w:space="0" w:sz="0" w:val="nil"/>
+          <w:right w:space="0" w:sz="0" w:val="nil"/>
+          <w:between w:space="0" w:sz="0" w:val="nil"/>
+        </w:pBdr>
+        <w:shd w:fill="auto" w:val="clear"/>
+        <w:spacing w:after="45" w:before="0" w:line="290" w:lineRule="auto"/>
+        <w:ind w:left="360" w:right="0" w:hanging="360"/>
+        <w:jc w:val="both"/>
+        <w:rPr>
+          <w:rFonts w:ascii="Helvetica Neue" w:cs="Helvetica Neue" w:eastAsia="Helvetica Neue" w:hAnsi="Helvetica Neue"/>
+        </w:rPr>
+      </w:pPr>
+      <w:r>
+        <w:t>A comparação identifica diferenças de texto e não determina equivalência jurídica.</w:t>
+      </w:r>
+    </w:p>
+    <w:p ns1:paraId="000000DF">
+      <w:pPr>
+        <w:keepNext w:val="1"/>
+        <w:keepLines w:val="0"/>
+        <w:pageBreakBefore w:val="0"/>
+        <w:widowControl w:val="1"/>
+        <w:numPr>
+          <w:ilvl w:val="0"/>
+          <w:numId w:val="3"/>
+        </w:numPr>
+        <w:pBdr>
+          <w:top w:space="0" w:sz="0" w:val="nil"/>
+          <w:left w:space="0" w:sz="0" w:val="nil"/>
+          <w:bottom w:space="0" w:sz="0" w:val="nil"/>
+          <w:right w:space="0" w:sz="0" w:val="nil"/>
+          <w:between w:space="0" w:sz="0" w:val="nil"/>
+        </w:pBdr>
+        <w:shd w:fill="auto" w:val="clear"/>
+        <w:spacing w:after="45" w:before="0" w:line="290" w:lineRule="auto"/>
+        <w:ind w:left="360" w:right="0" w:hanging="360"/>
+        <w:jc w:val="both"/>
+        <w:rPr>
+          <w:rFonts w:ascii="Helvetica Neue" w:cs="Helvetica Neue" w:eastAsia="Helvetica Neue" w:hAnsi="Helvetica Neue"/>
+        </w:rPr>
+      </w:pPr>
+      <w:r>
+        <w:t>Citações verificadas confirmam presença textual; a interpretação é conferida pelo usuário.</w:t>
+      </w:r>
+    </w:p>
+    <w:p ns1:paraId="000000E0">
+      <w:pPr>
+        <w:keepNext w:val="1"/>
+        <w:keepLines w:val="0"/>
+        <w:pageBreakBefore w:val="0"/>
+        <w:widowControl w:val="1"/>
+        <w:numPr>
+          <w:ilvl w:val="0"/>
+          <w:numId w:val="3"/>
+        </w:numPr>
+        <w:pBdr>
+          <w:top w:space="0" w:sz="0" w:val="nil"/>
+          <w:left w:space="0" w:sz="0" w:val="nil"/>
+          <w:bottom w:space="0" w:sz="0" w:val="nil"/>
+          <w:right w:space="0" w:sz="0" w:val="nil"/>
+          <w:between w:space="0" w:sz="0" w:val="nil"/>
+        </w:pBdr>
+        <w:shd w:fill="auto" w:val="clear"/>
+        <w:spacing w:after="45" w:before="0" w:line="290" w:lineRule="auto"/>
+        <w:ind w:left="360" w:right="0" w:hanging="360"/>
+        <w:jc w:val="both"/>
+        <w:rPr>
+          <w:rFonts w:ascii="Helvetica Neue" w:cs="Helvetica Neue" w:eastAsia="Helvetica Neue" w:hAnsi="Helvetica Neue"/>
+        </w:rPr>
+      </w:pPr>
+      <w:r>
+        <w:t>Informações ausentes permanecem não identificadas, sem presumir cobertura ou exclusão.</w:t>
+      </w:r>
+    </w:p>
+    <w:p ns1:paraId="000000E1">
       <w:pPr>
         <w:keepNext w:val="0"/>
         <w:keepLines w:val="0"/>
@@ -5086,94 +5179,7 @@
         </w:rPr>
       </w:pPr>
       <w:r>
-        <w:t>Qual provedor de OCR e modelo deve ser homologado para documentos reais em produção?</w:t>
-      </w:r>
-    </w:p>
-    <w:p ns1:paraId="000000DF">
-      <w:pPr>
-        <w:keepNext w:val="0"/>
-        <w:keepLines w:val="0"/>
-        <w:pageBreakBefore w:val="0"/>
-        <w:widowControl w:val="1"/>
-        <w:numPr>
-          <w:ilvl w:val="0"/>
-          <w:numId w:val="3"/>
-        </w:numPr>
-        <w:pBdr>
-          <w:top w:space="0" w:sz="0" w:val="nil"/>
-          <w:left w:space="0" w:sz="0" w:val="nil"/>
-          <w:bottom w:space="0" w:sz="0" w:val="nil"/>
-          <w:right w:space="0" w:sz="0" w:val="nil"/>
-          <w:between w:space="0" w:sz="0" w:val="nil"/>
-        </w:pBdr>
-        <w:shd w:fill="auto" w:val="clear"/>
-        <w:spacing w:after="45" w:before="0" w:line="290" w:lineRule="auto"/>
-        <w:ind w:left="360" w:right="0" w:hanging="360"/>
-        <w:jc w:val="both"/>
-        <w:rPr>
-          <w:rFonts w:ascii="Helvetica Neue" w:cs="Helvetica Neue" w:eastAsia="Helvetica Neue" w:hAnsi="Helvetica Neue"/>
-        </w:rPr>
-      </w:pPr>
-      <w:r>
-        <w:t>Quais campos e regras jurídicas devem receber revisão obrigatória de especialista?</w:t>
-      </w:r>
-    </w:p>
-    <w:p ns1:paraId="000000E0">
-      <w:pPr>
-        <w:keepNext w:val="0"/>
-        <w:keepLines w:val="0"/>
-        <w:pageBreakBefore w:val="0"/>
-        <w:widowControl w:val="1"/>
-        <w:numPr>
-          <w:ilvl w:val="0"/>
-          <w:numId w:val="3"/>
-        </w:numPr>
-        <w:pBdr>
-          <w:top w:space="0" w:sz="0" w:val="nil"/>
-          <w:left w:space="0" w:sz="0" w:val="nil"/>
-          <w:bottom w:space="0" w:sz="0" w:val="nil"/>
-          <w:right w:space="0" w:sz="0" w:val="nil"/>
-          <w:between w:space="0" w:sz="0" w:val="nil"/>
-        </w:pBdr>
-        <w:shd w:fill="auto" w:val="clear"/>
-        <w:spacing w:after="45" w:before="0" w:line="290" w:lineRule="auto"/>
-        <w:ind w:left="360" w:right="0" w:hanging="360"/>
-        <w:jc w:val="both"/>
-        <w:rPr>
-          <w:rFonts w:ascii="Helvetica Neue" w:cs="Helvetica Neue" w:eastAsia="Helvetica Neue" w:hAnsi="Helvetica Neue"/>
-        </w:rPr>
-      </w:pPr>
-      <w:r>
-        <w:t>A solução deve permanecer local ou evoluir para nuvem com isolamento por organização?</w:t>
-      </w:r>
-    </w:p>
-    <w:p ns1:paraId="000000E1">
-      <w:pPr>
-        <w:keepNext w:val="0"/>
-        <w:keepLines w:val="0"/>
-        <w:pageBreakBefore w:val="0"/>
-        <w:widowControl w:val="1"/>
-        <w:numPr>
-          <w:ilvl w:val="0"/>
-          <w:numId w:val="3"/>
-        </w:numPr>
-        <w:pBdr>
-          <w:top w:space="0" w:sz="0" w:val="nil"/>
-          <w:left w:space="0" w:sz="0" w:val="nil"/>
-          <w:bottom w:space="0" w:sz="0" w:val="nil"/>
-          <w:right w:space="0" w:sz="0" w:val="nil"/>
-          <w:between w:space="0" w:sz="0" w:val="nil"/>
-        </w:pBdr>
-        <w:shd w:fill="auto" w:val="clear"/>
-        <w:spacing w:after="45" w:before="0" w:line="290" w:lineRule="auto"/>
-        <w:ind w:left="360" w:right="0" w:hanging="360"/>
-        <w:jc w:val="both"/>
-        <w:rPr>
-          <w:rFonts w:ascii="Helvetica Neue" w:cs="Helvetica Neue" w:eastAsia="Helvetica Neue" w:hAnsi="Helvetica Neue"/>
-        </w:rPr>
-      </w:pPr>
-      <w:r>
-        <w:t>Qual política de retenção e controle de acesso será exigida para apólices reais?</w:t>
+        <w:t>Leituras de páginas rasterizadas e valores divergentes são sinalizados para revisão.</w:t>
       </w:r>
     </w:p>
     <w:p ns1:paraId="000000E2">
@@ -5199,7 +5205,7 @@
         </w:rPr>
       </w:pPr>
       <w:r>
-        <w:t>12. Decision and Next Steps</w:t>
+        <w:t>12 Validação do projeto</w:t>
       </w:r>
     </w:p>
     <w:p ns1:paraId="000000E4">
@@ -5211,7 +5217,7 @@
         </w:rPr>
       </w:pPr>
       <w:r>
-        <w:t>Validação funcional concluída com dois PDFs fictícios e Gemini 3.8 Flash: 16 critérios com evidências verificadas por documento, 10 diferenças e exportações PDF/JSON aprovadas. Registro: Validacao_IA_Exemplos.json. Suíte: 32 testes Python e um teste Node, build e QA da interface. A precisão contratual em documentos de mercado permanece sujeita à revisão especializada.</w:t>
+        <w:t>Os dois PDFs fictícios foram processados pelo Gemini 3.8 Flash, com 16 critérios e evidências verificadas por documento. A comparação apresentou 10 diferenças e nenhuma ausência; as exportações PDF e JSON passaram. O registro está em Validacao_IA_Exemplos.json. A suíte aprovou 32 testes Python e um teste Node, além do build e da verificação de interface em desktop e celular.</w:t>
       </w:r>
     </w:p>
     <w:tbl>
@@ -5269,7 +5275,7 @@
               <w:rPr>
                 <w:color w:val="FFFFFF"/>
               </w:rPr>
-              <w:t>Milestone</w:t>
+              <w:t>Verificação</w:t>
             </w:r>
           </w:p>
         </w:tc>
@@ -5295,7 +5301,7 @@
               <w:rPr>
                 <w:color w:val="FFFFFF"/>
               </w:rPr>
-              <w:t>Deliverable</w:t>
+              <w:t>Evidência</w:t>
             </w:r>
           </w:p>
         </w:tc>
@@ -5321,7 +5327,7 @@
               <w:rPr>
                 <w:color w:val="FFFFFF"/>
               </w:rPr>
-              <w:t>Exit criteria</w:t>
+              <w:t>Resultado</w:t>
             </w:r>
           </w:p>
         </w:tc>
@@ -5350,7 +5356,7 @@
           </w:tcPr>
           <w:p>
             <w:r>
-              <w:t>M1 concluído</w:t>
+              <w:t>Extração com IA</w:t>
             </w:r>
           </w:p>
         </w:tc>
@@ -5373,7 +5379,7 @@
           </w:tcPr>
           <w:p>
             <w:r>
-              <w:t>Dois PDFs fictícios / IA real</w:t>
+              <w:t>Dois PDFs fictícios / Gemini 3.8</w:t>
             </w:r>
           </w:p>
         </w:tc>
@@ -5396,7 +5402,7 @@
           </w:tcPr>
           <w:p>
             <w:r>
-              <w:t>Extração, comparação e exportações aprovadas</w:t>
+              <w:t>16 critérios verificados por documento</w:t>
             </w:r>
           </w:p>
         </w:tc>
@@ -5425,7 +5431,7 @@
           </w:tcPr>
           <w:p>
             <w:r>
-              <w:t>M2</w:t>
+              <w:t>Comparação</w:t>
             </w:r>
           </w:p>
         </w:tc>
@@ -5448,7 +5454,7 @@
           </w:tcPr>
           <w:p>
             <w:r>
-              <w:t>Revisão de precisão</w:t>
+              <w:t>16 campos lado a lado</w:t>
             </w:r>
           </w:p>
         </w:tc>
@@ -5471,7 +5477,7 @@
           </w:tcPr>
           <w:p>
             <w:r>
-              <w:t>Amostra e divergências documentadas</w:t>
+              <w:t>10 diferenças e nenhuma ausência</w:t>
             </w:r>
           </w:p>
         </w:tc>
@@ -5500,7 +5506,7 @@
           </w:tcPr>
           <w:p>
             <w:r>
-              <w:t>M3</w:t>
+              <w:t>Exportações</w:t>
             </w:r>
           </w:p>
         </w:tc>
@@ -5523,7 +5529,7 @@
           </w:tcPr>
           <w:p>
             <w:r>
-              <w:t>Autenticação e observabilidade</w:t>
+              <w:t>PDF e JSON</w:t>
             </w:r>
           </w:p>
         </w:tc>
@@ -5546,7 +5552,7 @@
           </w:tcPr>
           <w:p>
             <w:r>
-              <w:t>Controles testados</w:t>
+              <w:t>Conteúdo e formato aprovados</w:t>
             </w:r>
           </w:p>
         </w:tc>
@@ -5575,7 +5581,7 @@
           </w:tcPr>
           <w:p>
             <w:r>
-              <w:t>M4</w:t>
+              <w:t>Interface e código</w:t>
             </w:r>
           </w:p>
         </w:tc>
@@ -5598,7 +5604,7 @@
           </w:tcPr>
           <w:p>
             <w:r>
-              <w:t>Piloto controlado</w:t>
+              <w:t>Desktop, celular e suíte</w:t>
             </w:r>
           </w:p>
         </w:tc>
@@ -5621,7 +5627,7 @@
           </w:tcPr>
           <w:p>
             <w:r>
-              <w:t>SLOs, rollback e aprovação</w:t>
+              <w:t>Build e testes aprovados</w:t>
             </w:r>
           </w:p>
         </w:tc>

</xml_diff>